<commit_message>
feat: integrate DWG-backed AutoCAD labs
</commit_message>
<xml_diff>
--- a/courseware/LG-WSQ Technical Drawing with AutoCAD.docx
+++ b/courseware/LG-WSQ Technical Drawing with AutoCAD.docx
@@ -179,7 +179,7 @@
           <w:color w:val="1F6FEB"/>
           <w:sz w:val="24"/>
         </w:rPr>
-        <w:t>Version 12</w:t>
+        <w:t>Version 13</w:t>
       </w:r>
     </w:p>
     <w:p>
@@ -380,7 +380,65 @@
               <w:rPr>
                 <w:sz w:val="19"/>
               </w:rPr>
-              <w:t>Full regeneration in the single-source pipeline: 16 step-by-step labs in per-lab folders (DWG data files + PDF instruction sheets), drawing-reading quick reference, assessment preparation guidance and glossary — 100% aligned with the v12 slide deck and Lesson Plan.</w:t>
+              <w:t>Full single-source regeneration with 16 step-by-step labs, drawing-reading reference, assessment preparation guidance and glossary.</w:t>
+            </w:r>
+          </w:p>
+        </w:tc>
+        <w:tc>
+          <w:tcPr>
+            <w:tcW w:type="dxa" w:w="2160"/>
+          </w:tcPr>
+          <w:p>
+            <w:r/>
+            <w:r>
+              <w:rPr>
+                <w:sz w:val="19"/>
+              </w:rPr>
+              <w:t>Dr Alfred Ang</w:t>
+            </w:r>
+          </w:p>
+        </w:tc>
+      </w:tr>
+      <w:tr>
+        <w:tc>
+          <w:tcPr>
+            <w:tcW w:type="dxa" w:w="2160"/>
+          </w:tcPr>
+          <w:p>
+            <w:r/>
+            <w:r>
+              <w:rPr>
+                <w:sz w:val="19"/>
+              </w:rPr>
+              <w:t>13</w:t>
+            </w:r>
+          </w:p>
+        </w:tc>
+        <w:tc>
+          <w:tcPr>
+            <w:tcW w:type="dxa" w:w="2160"/>
+          </w:tcPr>
+          <w:p>
+            <w:r/>
+            <w:r>
+              <w:rPr>
+                <w:sz w:val="19"/>
+              </w:rPr>
+              <w:t>21 August 2026</w:t>
+            </w:r>
+          </w:p>
+        </w:tc>
+        <w:tc>
+          <w:tcPr>
+            <w:tcW w:type="dxa" w:w="2160"/>
+          </w:tcPr>
+          <w:p>
+            <w:r/>
+            <w:r>
+              <w:rPr>
+                <w:sz w:val="19"/>
+              </w:rPr>
+              <w:t>DWG integration release: strengthened Labs 1, 8–12, 15 and 16 with active practice files, repaired the Lab 12 Landscaping_REV1 relative Xref dependency, and retained all detailed procedures in the Learner Guide and lab packs for alignment with the concept-led v13 deck.</w:t>
             </w:r>
           </w:p>
         </w:tc>
@@ -590,7 +648,7 @@
         </w:rPr>
         <w:t>Lab 4 — Polylines, Arcs, Ellipses and Splines</w:t>
         <w:tab/>
-        <w:t>9</w:t>
+        <w:t>10</w:t>
       </w:r>
     </w:p>
     <w:p>
@@ -649,7 +707,7 @@
         </w:rPr>
         <w:t>Lab 6 — Move, Copy, Rotate and Offset</w:t>
         <w:tab/>
-        <w:t>12</w:t>
+        <w:t>13</w:t>
       </w:r>
     </w:p>
     <w:p>
@@ -708,7 +766,7 @@
         </w:rPr>
         <w:t>Topic 04 — Organizing Objects  (A4 · K4)</w:t>
         <w:tab/>
-        <w:t>16</w:t>
+        <w:t>17</w:t>
       </w:r>
     </w:p>
     <w:p>
@@ -768,7 +826,7 @@
         </w:rPr>
         <w:t>Lab 11 — Blocks, Attributes and Part Lists</w:t>
         <w:tab/>
-        <w:t>19</w:t>
+        <w:t>20</w:t>
       </w:r>
     </w:p>
     <w:p>
@@ -788,7 +846,7 @@
         </w:rPr>
         <w:t>Lab 12 — External References and PDF Import</w:t>
         <w:tab/>
-        <w:t>20</w:t>
+        <w:t>21</w:t>
       </w:r>
     </w:p>
     <w:p>
@@ -807,7 +865,7 @@
         </w:rPr>
         <w:t>Topic 05 — Design Documentation  (A5 · K5)</w:t>
         <w:tab/>
-        <w:t>21</w:t>
+        <w:t>22</w:t>
       </w:r>
     </w:p>
     <w:p>
@@ -827,7 +885,7 @@
         </w:rPr>
         <w:t>Lab 13 — Text and Text Styles</w:t>
         <w:tab/>
-        <w:t>21</w:t>
+        <w:t>22</w:t>
       </w:r>
     </w:p>
     <w:p>
@@ -847,7 +905,7 @@
         </w:rPr>
         <w:t>Lab 14 — Dimensions, Multileaders and Part-List Tables</w:t>
         <w:tab/>
-        <w:t>22</w:t>
+        <w:t>23</w:t>
       </w:r>
     </w:p>
     <w:p>
@@ -867,7 +925,7 @@
         </w:rPr>
         <w:t>Lab 15 — Hatching and Detail Finishing</w:t>
         <w:tab/>
-        <w:t>24</w:t>
+        <w:t>25</w:t>
       </w:r>
     </w:p>
     <w:p>
@@ -887,7 +945,7 @@
         </w:rPr>
         <w:t>Lab 16 — Layouts, Viewports and Plotting</w:t>
         <w:tab/>
-        <w:t>25</w:t>
+        <w:t>26</w:t>
       </w:r>
     </w:p>
     <w:p>
@@ -906,7 +964,7 @@
         </w:rPr>
         <w:t>Reading Technical Drawings — Quick Reference</w:t>
         <w:tab/>
-        <w:t>26</w:t>
+        <w:t>27</w:t>
       </w:r>
     </w:p>
     <w:p>
@@ -925,7 +983,7 @@
         </w:rPr>
         <w:t>Preparing for the Assessment</w:t>
         <w:tab/>
-        <w:t>26</w:t>
+        <w:t>28</w:t>
       </w:r>
     </w:p>
     <w:p>
@@ -944,7 +1002,7 @@
         </w:rPr>
         <w:t>Glossary</w:t>
         <w:tab/>
-        <w:t>27</w:t>
+        <w:t>28</w:t>
       </w:r>
     </w:p>
     <w:p>
@@ -955,6 +1013,7 @@
     <w:p>
       <w:pPr>
         <w:pStyle w:val="Heading1"/>
+        <w:keepNext/>
       </w:pPr>
       <w:r>
         <w:t>Introduction</w:t>
@@ -973,6 +1032,7 @@
     <w:p>
       <w:pPr>
         <w:pStyle w:val="Heading1"/>
+        <w:keepNext/>
       </w:pPr>
       <w:r>
         <w:t>Course Learning Outcomes</w:t>
@@ -1021,12 +1081,16 @@
     <w:p>
       <w:pPr>
         <w:pStyle w:val="Heading1"/>
+        <w:keepNext/>
       </w:pPr>
       <w:r>
         <w:t>Before You Start — Environment Setup</w:t>
       </w:r>
     </w:p>
     <w:p>
+      <w:pPr>
+        <w:keepNext/>
+      </w:pPr>
       <w:r>
         <w:rPr>
           <w:b/>
@@ -1069,6 +1133,9 @@
       </w:r>
     </w:p>
     <w:p>
+      <w:pPr>
+        <w:keepNext/>
+      </w:pPr>
       <w:r>
         <w:rPr>
           <w:b/>
@@ -1111,6 +1178,9 @@
       </w:r>
     </w:p>
     <w:p>
+      <w:pPr>
+        <w:keepNext/>
+      </w:pPr>
       <w:r>
         <w:rPr>
           <w:b/>
@@ -1163,6 +1233,7 @@
     <w:p>
       <w:pPr>
         <w:pStyle w:val="Heading1"/>
+        <w:keepNext/>
       </w:pPr>
       <w:r>
         <w:t>Topic 01 — Getting Started with AutoCAD  (A1 · K1)</w:t>
@@ -1174,6 +1245,9 @@
       </w:r>
     </w:p>
     <w:p>
+      <w:pPr>
+        <w:keepNext/>
+      </w:pPr>
       <w:r>
         <w:rPr>
           <w:b/>
@@ -1234,6 +1308,7 @@
     <w:p>
       <w:pPr>
         <w:pStyle w:val="Heading2"/>
+        <w:keepNext/>
       </w:pPr>
       <w:r>
         <w:t>Lab 1 — Setting Up a New Drawing</w:t>
@@ -1246,10 +1321,13 @@
     </w:p>
     <w:p>
       <w:r>
-        <w:t>Goal: Create a new metric drawing from the ACADISO template, choose the Drafting &amp; Annotation workspace, set units and limits, then open a finished drawing and practise reading it with the zoom, pan and ViewCube navigation tools.</w:t>
-      </w:r>
-    </w:p>
-    <w:p>
+        <w:t>Goal: Create and verify a metric drawing environment, compare saved workspace and drafting-setting examples, then open a finished drawing and practise reading it with zoom, pan and ViewCube.</w:t>
+      </w:r>
+    </w:p>
+    <w:p>
+      <w:pPr>
+        <w:keepNext/>
+      </w:pPr>
       <w:r>
         <w:rPr>
           <w:b/>
@@ -1261,10 +1339,13 @@
     </w:p>
     <w:p>
       <w:r>
-        <w:t>A correctly configured metric drawing (units, limits, workspace) saved as DWG, plus confident navigation of an existing technical drawing.   (Commands: ACADISO template, UNITS, LIMITS, ZOOM, PAN, ViewCube.)</w:t>
-      </w:r>
-    </w:p>
-    <w:p>
+        <w:t>A correctly configured metric drawing saved as DWG, a settings audit, and confident navigation of an existing technical drawing.   (Commands: ACADISO template, UNITS, LIMITS, DSETTINGS, WSCURRENT, ZOOM, PAN, ViewCube.)</w:t>
+      </w:r>
+    </w:p>
+    <w:p>
+      <w:pPr>
+        <w:keepNext/>
+      </w:pPr>
       <w:r>
         <w:rPr>
           <w:b/>
@@ -1276,6 +1357,8 @@
     </w:p>
     <w:p>
       <w:pPr>
+        <w:keepNext/>
+        <w:keepLines/>
         <w:ind w:left="360"/>
       </w:pPr>
       <w:r>
@@ -1289,6 +1372,9 @@
       </w:r>
     </w:p>
     <w:p>
+      <w:pPr>
+        <w:keepLines/>
+      </w:pPr>
       <w:r>
         <w:rPr>
           <w:rFonts w:ascii="Consolas" w:hAnsi="Consolas"/>
@@ -1300,6 +1386,8 @@
     </w:p>
     <w:p>
       <w:pPr>
+        <w:keepNext/>
+        <w:keepLines/>
         <w:ind w:left="360"/>
       </w:pPr>
       <w:r>
@@ -1309,21 +1397,26 @@
         <w:t xml:space="preserve">2.  </w:t>
       </w:r>
       <w:r>
-        <w:t>Switch the workspace to Drafting &amp; Annotation from the status bar gear icon</w:t>
-      </w:r>
-    </w:p>
-    <w:p>
+        <w:t>Open workspaces.dwg, compare the available workspaces, then switch to Drafting &amp; Annotation</w:t>
+      </w:r>
+    </w:p>
+    <w:p>
+      <w:pPr>
+        <w:keepLines/>
+      </w:pPr>
       <w:r>
         <w:rPr>
           <w:rFonts w:ascii="Consolas" w:hAnsi="Consolas"/>
           <w:color w:val="0B3060"/>
           <w:sz w:val="19"/>
         </w:rPr>
-        <w:t xml:space="preserve">     WSCURRENT → Drafting &amp; Annotation</w:t>
-      </w:r>
-    </w:p>
-    <w:p>
-      <w:pPr>
+        <w:t xml:space="preserve">     OPEN workspaces.dwg → WSCURRENT → Drafting &amp; Annotation</w:t>
+      </w:r>
+    </w:p>
+    <w:p>
+      <w:pPr>
+        <w:keepNext/>
+        <w:keepLines/>
         <w:ind w:left="360"/>
       </w:pPr>
       <w:r>
@@ -1333,21 +1426,26 @@
         <w:t xml:space="preserve">3.  </w:t>
       </w:r>
       <w:r>
-        <w:t>Set decimal length units with 0.00 precision and decimal degrees for angles</w:t>
-      </w:r>
-    </w:p>
-    <w:p>
+        <w:t>Set decimal millimetres with 0.00 precision and decimal degrees for angles</w:t>
+      </w:r>
+    </w:p>
+    <w:p>
+      <w:pPr>
+        <w:keepLines/>
+      </w:pPr>
       <w:r>
         <w:rPr>
           <w:rFonts w:ascii="Consolas" w:hAnsi="Consolas"/>
           <w:color w:val="0B3060"/>
           <w:sz w:val="19"/>
         </w:rPr>
-        <w:t xml:space="preserve">     UNITS → Length: Decimal, Precision 0.00</w:t>
-      </w:r>
-    </w:p>
-    <w:p>
-      <w:pPr>
+        <w:t xml:space="preserve">     UNITS → Insertion scale: Millimetres → Length: Decimal, 0.00</w:t>
+      </w:r>
+    </w:p>
+    <w:p>
+      <w:pPr>
+        <w:keepNext/>
+        <w:keepLines/>
         <w:ind w:left="360"/>
       </w:pPr>
       <w:r>
@@ -1361,6 +1459,9 @@
       </w:r>
     </w:p>
     <w:p>
+      <w:pPr>
+        <w:keepLines/>
+      </w:pPr>
       <w:r>
         <w:rPr>
           <w:rFonts w:ascii="Consolas" w:hAnsi="Consolas"/>
@@ -1372,6 +1473,8 @@
     </w:p>
     <w:p>
       <w:pPr>
+        <w:keepNext/>
+        <w:keepLines/>
         <w:ind w:left="360"/>
       </w:pPr>
       <w:r>
@@ -1381,21 +1484,26 @@
         <w:t xml:space="preserve">5.  </w:t>
       </w:r>
       <w:r>
-        <w:t>Toggle the precision aids on the status bar: grid, snap, ortho, polar and object snap</w:t>
-      </w:r>
-    </w:p>
-    <w:p>
+        <w:t>Open drafting-settings.dwg and audit grid, snap, ortho, polar and object-snap settings</w:t>
+      </w:r>
+    </w:p>
+    <w:p>
+      <w:pPr>
+        <w:keepLines/>
+      </w:pPr>
       <w:r>
         <w:rPr>
           <w:rFonts w:ascii="Consolas" w:hAnsi="Consolas"/>
           <w:color w:val="0B3060"/>
           <w:sz w:val="19"/>
         </w:rPr>
-        <w:t xml:space="preserve">     F7 grid · F9 snap · F8 ortho · F10 polar · F3 osnap</w:t>
-      </w:r>
-    </w:p>
-    <w:p>
-      <w:pPr>
+        <w:t xml:space="preserve">     OPEN drafting-settings.dwg → DSETTINGS · F7 · F9 · F8 · F10 · F3</w:t>
+      </w:r>
+    </w:p>
+    <w:p>
+      <w:pPr>
+        <w:keepNext/>
+        <w:keepLines/>
         <w:ind w:left="360"/>
       </w:pPr>
       <w:r>
@@ -1409,6 +1517,9 @@
       </w:r>
     </w:p>
     <w:p>
+      <w:pPr>
+        <w:keepLines/>
+      </w:pPr>
       <w:r>
         <w:rPr>
           <w:rFonts w:ascii="Consolas" w:hAnsi="Consolas"/>
@@ -1420,6 +1531,8 @@
     </w:p>
     <w:p>
       <w:pPr>
+        <w:keepNext/>
+        <w:keepLines/>
         <w:ind w:left="360"/>
       </w:pPr>
       <w:r>
@@ -1433,6 +1546,9 @@
       </w:r>
     </w:p>
     <w:p>
+      <w:pPr>
+        <w:keepLines/>
+      </w:pPr>
       <w:r>
         <w:rPr>
           <w:rFonts w:ascii="Consolas" w:hAnsi="Consolas"/>
@@ -1443,6 +1559,9 @@
       </w:r>
     </w:p>
     <w:p>
+      <w:pPr>
+        <w:keepNext/>
+      </w:pPr>
       <w:r>
         <w:rPr>
           <w:b/>
@@ -1454,7 +1573,7 @@
     </w:p>
     <w:p>
       <w:r>
-        <w:t>You can state the drawing's units, limits and workspace; zoom to any detail of lab01-table.dwg and back to extents; and your lab01-setup.dwg opens with the settings intact.</w:t>
+        <w:t>INSUNITS reports millimetres, limits are 420 × 297, Drafting &amp; Annotation is current, the precision-aid audit is complete, and lab01-setup.dwg reopens with the settings intact.</w:t>
       </w:r>
     </w:p>
     <w:p>
@@ -1476,6 +1595,7 @@
     <w:p>
       <w:pPr>
         <w:pStyle w:val="Heading1"/>
+        <w:keepNext/>
       </w:pPr>
       <w:r>
         <w:t>Topic 02 — Technical Drawing with AutoCAD  (A2 · K2)</w:t>
@@ -1487,6 +1607,9 @@
       </w:r>
     </w:p>
     <w:p>
+      <w:pPr>
+        <w:keepNext/>
+      </w:pPr>
       <w:r>
         <w:rPr>
           <w:b/>
@@ -1547,6 +1670,7 @@
     <w:p>
       <w:pPr>
         <w:pStyle w:val="Heading2"/>
+        <w:keepNext/>
       </w:pPr>
       <w:r>
         <w:t>Lab 2 — Creating Lines and Coordinates</w:t>
@@ -1609,6 +1733,9 @@
       </w:r>
     </w:p>
     <w:p>
+      <w:pPr>
+        <w:keepNext/>
+      </w:pPr>
       <w:r>
         <w:rPr>
           <w:b/>
@@ -1624,6 +1751,9 @@
       </w:r>
     </w:p>
     <w:p>
+      <w:pPr>
+        <w:keepNext/>
+      </w:pPr>
       <w:r>
         <w:rPr>
           <w:b/>
@@ -1635,6 +1765,8 @@
     </w:p>
     <w:p>
       <w:pPr>
+        <w:keepNext w:val="0"/>
+        <w:keepLines/>
         <w:ind w:left="360"/>
       </w:pPr>
       <w:r>
@@ -1649,6 +1781,8 @@
     </w:p>
     <w:p>
       <w:pPr>
+        <w:keepNext/>
+        <w:keepLines/>
         <w:ind w:left="360"/>
       </w:pPr>
       <w:r>
@@ -1662,6 +1796,9 @@
       </w:r>
     </w:p>
     <w:p>
+      <w:pPr>
+        <w:keepLines/>
+      </w:pPr>
       <w:r>
         <w:rPr>
           <w:rFonts w:ascii="Consolas" w:hAnsi="Consolas"/>
@@ -1673,6 +1810,8 @@
     </w:p>
     <w:p>
       <w:pPr>
+        <w:keepNext/>
+        <w:keepLines/>
         <w:ind w:left="360"/>
       </w:pPr>
       <w:r>
@@ -1686,6 +1825,9 @@
       </w:r>
     </w:p>
     <w:p>
+      <w:pPr>
+        <w:keepLines/>
+      </w:pPr>
       <w:r>
         <w:rPr>
           <w:rFonts w:ascii="Consolas" w:hAnsi="Consolas"/>
@@ -1697,6 +1839,8 @@
     </w:p>
     <w:p>
       <w:pPr>
+        <w:keepNext/>
+        <w:keepLines/>
         <w:ind w:left="360"/>
       </w:pPr>
       <w:r>
@@ -1710,6 +1854,9 @@
       </w:r>
     </w:p>
     <w:p>
+      <w:pPr>
+        <w:keepLines/>
+      </w:pPr>
       <w:r>
         <w:rPr>
           <w:rFonts w:ascii="Consolas" w:hAnsi="Consolas"/>
@@ -1721,6 +1868,8 @@
     </w:p>
     <w:p>
       <w:pPr>
+        <w:keepNext/>
+        <w:keepLines/>
         <w:ind w:left="360"/>
       </w:pPr>
       <w:r>
@@ -1734,6 +1883,9 @@
       </w:r>
     </w:p>
     <w:p>
+      <w:pPr>
+        <w:keepLines/>
+      </w:pPr>
       <w:r>
         <w:rPr>
           <w:rFonts w:ascii="Consolas" w:hAnsi="Consolas"/>
@@ -1745,6 +1897,8 @@
     </w:p>
     <w:p>
       <w:pPr>
+        <w:keepNext/>
+        <w:keepLines/>
         <w:ind w:left="360"/>
       </w:pPr>
       <w:r>
@@ -1758,6 +1912,9 @@
       </w:r>
     </w:p>
     <w:p>
+      <w:pPr>
+        <w:keepLines/>
+      </w:pPr>
       <w:r>
         <w:rPr>
           <w:rFonts w:ascii="Consolas" w:hAnsi="Consolas"/>
@@ -1768,6 +1925,9 @@
       </w:r>
     </w:p>
     <w:p>
+      <w:pPr>
+        <w:keepNext/>
+      </w:pPr>
       <w:r>
         <w:rPr>
           <w:b/>
@@ -1801,6 +1961,7 @@
     <w:p>
       <w:pPr>
         <w:pStyle w:val="Heading2"/>
+        <w:keepNext/>
       </w:pPr>
       <w:r>
         <w:t>Lab 3 — Circles, Rectangles and Polygons</w:t>
@@ -1863,6 +2024,9 @@
       </w:r>
     </w:p>
     <w:p>
+      <w:pPr>
+        <w:keepNext/>
+      </w:pPr>
       <w:r>
         <w:rPr>
           <w:b/>
@@ -1878,6 +2042,9 @@
       </w:r>
     </w:p>
     <w:p>
+      <w:pPr>
+        <w:keepNext/>
+      </w:pPr>
       <w:r>
         <w:rPr>
           <w:b/>
@@ -1889,6 +2056,8 @@
     </w:p>
     <w:p>
       <w:pPr>
+        <w:keepNext w:val="0"/>
+        <w:keepLines/>
         <w:ind w:left="360"/>
       </w:pPr>
       <w:r>
@@ -1903,6 +2072,8 @@
     </w:p>
     <w:p>
       <w:pPr>
+        <w:keepNext/>
+        <w:keepLines/>
         <w:ind w:left="360"/>
       </w:pPr>
       <w:r>
@@ -1916,6 +2087,9 @@
       </w:r>
     </w:p>
     <w:p>
+      <w:pPr>
+        <w:keepLines/>
+      </w:pPr>
       <w:r>
         <w:rPr>
           <w:rFonts w:ascii="Consolas" w:hAnsi="Consolas"/>
@@ -1927,6 +2101,8 @@
     </w:p>
     <w:p>
       <w:pPr>
+        <w:keepNext/>
+        <w:keepLines/>
         <w:ind w:left="360"/>
       </w:pPr>
       <w:r>
@@ -1940,6 +2116,9 @@
       </w:r>
     </w:p>
     <w:p>
+      <w:pPr>
+        <w:keepLines/>
+      </w:pPr>
       <w:r>
         <w:rPr>
           <w:rFonts w:ascii="Consolas" w:hAnsi="Consolas"/>
@@ -1951,6 +2130,8 @@
     </w:p>
     <w:p>
       <w:pPr>
+        <w:keepNext/>
+        <w:keepLines/>
         <w:ind w:left="360"/>
       </w:pPr>
       <w:r>
@@ -1964,6 +2145,9 @@
       </w:r>
     </w:p>
     <w:p>
+      <w:pPr>
+        <w:keepLines/>
+      </w:pPr>
       <w:r>
         <w:rPr>
           <w:rFonts w:ascii="Consolas" w:hAnsi="Consolas"/>
@@ -1975,6 +2159,8 @@
     </w:p>
     <w:p>
       <w:pPr>
+        <w:keepNext/>
+        <w:keepLines/>
         <w:ind w:left="360"/>
       </w:pPr>
       <w:r>
@@ -1988,6 +2174,9 @@
       </w:r>
     </w:p>
     <w:p>
+      <w:pPr>
+        <w:keepLines/>
+      </w:pPr>
       <w:r>
         <w:rPr>
           <w:rFonts w:ascii="Consolas" w:hAnsi="Consolas"/>
@@ -1999,6 +2188,8 @@
     </w:p>
     <w:p>
       <w:pPr>
+        <w:keepNext/>
+        <w:keepLines/>
         <w:ind w:left="360"/>
       </w:pPr>
       <w:r>
@@ -2012,6 +2203,9 @@
       </w:r>
     </w:p>
     <w:p>
+      <w:pPr>
+        <w:keepLines/>
+      </w:pPr>
       <w:r>
         <w:rPr>
           <w:rFonts w:ascii="Consolas" w:hAnsi="Consolas"/>
@@ -2022,6 +2216,9 @@
       </w:r>
     </w:p>
     <w:p>
+      <w:pPr>
+        <w:keepNext/>
+      </w:pPr>
       <w:r>
         <w:rPr>
           <w:b/>
@@ -2055,6 +2252,7 @@
     <w:p>
       <w:pPr>
         <w:pStyle w:val="Heading2"/>
+        <w:keepNext/>
       </w:pPr>
       <w:r>
         <w:t>Lab 4 — Polylines, Arcs, Ellipses and Splines</w:t>
@@ -2117,6 +2315,9 @@
       </w:r>
     </w:p>
     <w:p>
+      <w:pPr>
+        <w:keepNext/>
+      </w:pPr>
       <w:r>
         <w:rPr>
           <w:b/>
@@ -2132,6 +2333,9 @@
       </w:r>
     </w:p>
     <w:p>
+      <w:pPr>
+        <w:keepNext/>
+      </w:pPr>
       <w:r>
         <w:rPr>
           <w:b/>
@@ -2143,6 +2347,8 @@
     </w:p>
     <w:p>
       <w:pPr>
+        <w:keepNext w:val="0"/>
+        <w:keepLines/>
         <w:ind w:left="360"/>
       </w:pPr>
       <w:r>
@@ -2157,6 +2363,8 @@
     </w:p>
     <w:p>
       <w:pPr>
+        <w:keepNext/>
+        <w:keepLines/>
         <w:ind w:left="360"/>
       </w:pPr>
       <w:r>
@@ -2170,6 +2378,9 @@
       </w:r>
     </w:p>
     <w:p>
+      <w:pPr>
+        <w:keepLines/>
+      </w:pPr>
       <w:r>
         <w:rPr>
           <w:rFonts w:ascii="Consolas" w:hAnsi="Consolas"/>
@@ -2181,6 +2392,8 @@
     </w:p>
     <w:p>
       <w:pPr>
+        <w:keepNext/>
+        <w:keepLines/>
         <w:ind w:left="360"/>
       </w:pPr>
       <w:r>
@@ -2194,6 +2407,9 @@
       </w:r>
     </w:p>
     <w:p>
+      <w:pPr>
+        <w:keepLines/>
+      </w:pPr>
       <w:r>
         <w:rPr>
           <w:rFonts w:ascii="Consolas" w:hAnsi="Consolas"/>
@@ -2205,6 +2421,8 @@
     </w:p>
     <w:p>
       <w:pPr>
+        <w:keepNext/>
+        <w:keepLines/>
         <w:ind w:left="360"/>
       </w:pPr>
       <w:r>
@@ -2218,6 +2436,9 @@
       </w:r>
     </w:p>
     <w:p>
+      <w:pPr>
+        <w:keepLines/>
+      </w:pPr>
       <w:r>
         <w:rPr>
           <w:rFonts w:ascii="Consolas" w:hAnsi="Consolas"/>
@@ -2229,6 +2450,8 @@
     </w:p>
     <w:p>
       <w:pPr>
+        <w:keepNext/>
+        <w:keepLines/>
         <w:ind w:left="360"/>
       </w:pPr>
       <w:r>
@@ -2242,6 +2465,9 @@
       </w:r>
     </w:p>
     <w:p>
+      <w:pPr>
+        <w:keepLines/>
+      </w:pPr>
       <w:r>
         <w:rPr>
           <w:rFonts w:ascii="Consolas" w:hAnsi="Consolas"/>
@@ -2253,6 +2479,8 @@
     </w:p>
     <w:p>
       <w:pPr>
+        <w:keepNext/>
+        <w:keepLines/>
         <w:ind w:left="360"/>
       </w:pPr>
       <w:r>
@@ -2266,6 +2494,9 @@
       </w:r>
     </w:p>
     <w:p>
+      <w:pPr>
+        <w:keepLines/>
+      </w:pPr>
       <w:r>
         <w:rPr>
           <w:rFonts w:ascii="Consolas" w:hAnsi="Consolas"/>
@@ -2276,6 +2507,9 @@
       </w:r>
     </w:p>
     <w:p>
+      <w:pPr>
+        <w:keepNext/>
+      </w:pPr>
       <w:r>
         <w:rPr>
           <w:b/>
@@ -2309,6 +2543,7 @@
     <w:p>
       <w:pPr>
         <w:pStyle w:val="Heading2"/>
+        <w:keepNext/>
       </w:pPr>
       <w:r>
         <w:t>Lab 5 — 2D Isometric Drawing</w:t>
@@ -2371,6 +2606,9 @@
       </w:r>
     </w:p>
     <w:p>
+      <w:pPr>
+        <w:keepNext/>
+      </w:pPr>
       <w:r>
         <w:rPr>
           <w:b/>
@@ -2386,6 +2624,9 @@
       </w:r>
     </w:p>
     <w:p>
+      <w:pPr>
+        <w:keepNext/>
+      </w:pPr>
       <w:r>
         <w:rPr>
           <w:b/>
@@ -2397,6 +2638,8 @@
     </w:p>
     <w:p>
       <w:pPr>
+        <w:keepNext w:val="0"/>
+        <w:keepLines/>
         <w:ind w:left="360"/>
       </w:pPr>
       <w:r>
@@ -2411,6 +2654,8 @@
     </w:p>
     <w:p>
       <w:pPr>
+        <w:keepNext/>
+        <w:keepLines/>
         <w:ind w:left="360"/>
       </w:pPr>
       <w:r>
@@ -2424,6 +2669,9 @@
       </w:r>
     </w:p>
     <w:p>
+      <w:pPr>
+        <w:keepLines/>
+      </w:pPr>
       <w:r>
         <w:rPr>
           <w:rFonts w:ascii="Consolas" w:hAnsi="Consolas"/>
@@ -2435,6 +2683,8 @@
     </w:p>
     <w:p>
       <w:pPr>
+        <w:keepNext/>
+        <w:keepLines/>
         <w:ind w:left="360"/>
       </w:pPr>
       <w:r>
@@ -2448,6 +2698,9 @@
       </w:r>
     </w:p>
     <w:p>
+      <w:pPr>
+        <w:keepLines/>
+      </w:pPr>
       <w:r>
         <w:rPr>
           <w:rFonts w:ascii="Consolas" w:hAnsi="Consolas"/>
@@ -2459,6 +2712,8 @@
     </w:p>
     <w:p>
       <w:pPr>
+        <w:keepNext/>
+        <w:keepLines/>
         <w:ind w:left="360"/>
       </w:pPr>
       <w:r>
@@ -2472,6 +2727,9 @@
       </w:r>
     </w:p>
     <w:p>
+      <w:pPr>
+        <w:keepLines/>
+      </w:pPr>
       <w:r>
         <w:rPr>
           <w:rFonts w:ascii="Consolas" w:hAnsi="Consolas"/>
@@ -2483,6 +2741,8 @@
     </w:p>
     <w:p>
       <w:pPr>
+        <w:keepNext/>
+        <w:keepLines/>
         <w:ind w:left="360"/>
       </w:pPr>
       <w:r>
@@ -2496,6 +2756,9 @@
       </w:r>
     </w:p>
     <w:p>
+      <w:pPr>
+        <w:keepLines/>
+      </w:pPr>
       <w:r>
         <w:rPr>
           <w:rFonts w:ascii="Consolas" w:hAnsi="Consolas"/>
@@ -2507,6 +2770,8 @@
     </w:p>
     <w:p>
       <w:pPr>
+        <w:keepNext/>
+        <w:keepLines/>
         <w:ind w:left="360"/>
       </w:pPr>
       <w:r>
@@ -2520,6 +2785,9 @@
       </w:r>
     </w:p>
     <w:p>
+      <w:pPr>
+        <w:keepLines/>
+      </w:pPr>
       <w:r>
         <w:rPr>
           <w:rFonts w:ascii="Consolas" w:hAnsi="Consolas"/>
@@ -2530,6 +2798,9 @@
       </w:r>
     </w:p>
     <w:p>
+      <w:pPr>
+        <w:keepNext/>
+      </w:pPr>
       <w:r>
         <w:rPr>
           <w:b/>
@@ -2563,6 +2834,7 @@
     <w:p>
       <w:pPr>
         <w:pStyle w:val="Heading1"/>
+        <w:keepNext/>
       </w:pPr>
       <w:r>
         <w:t>Topic 03 — Modifying Objects  (A3 · K3)</w:t>
@@ -2574,6 +2846,9 @@
       </w:r>
     </w:p>
     <w:p>
+      <w:pPr>
+        <w:keepNext/>
+      </w:pPr>
       <w:r>
         <w:rPr>
           <w:b/>
@@ -2634,6 +2909,7 @@
     <w:p>
       <w:pPr>
         <w:pStyle w:val="Heading2"/>
+        <w:keepNext/>
       </w:pPr>
       <w:r>
         <w:t>Lab 6 — Move, Copy, Rotate and Offset</w:t>
@@ -2696,6 +2972,9 @@
       </w:r>
     </w:p>
     <w:p>
+      <w:pPr>
+        <w:keepNext/>
+      </w:pPr>
       <w:r>
         <w:rPr>
           <w:b/>
@@ -2711,6 +2990,9 @@
       </w:r>
     </w:p>
     <w:p>
+      <w:pPr>
+        <w:keepNext/>
+      </w:pPr>
       <w:r>
         <w:rPr>
           <w:b/>
@@ -2722,6 +3004,8 @@
     </w:p>
     <w:p>
       <w:pPr>
+        <w:keepNext w:val="0"/>
+        <w:keepLines/>
         <w:ind w:left="360"/>
       </w:pPr>
       <w:r>
@@ -2736,6 +3020,8 @@
     </w:p>
     <w:p>
       <w:pPr>
+        <w:keepNext/>
+        <w:keepLines/>
         <w:ind w:left="360"/>
       </w:pPr>
       <w:r>
@@ -2749,6 +3035,9 @@
       </w:r>
     </w:p>
     <w:p>
+      <w:pPr>
+        <w:keepLines/>
+      </w:pPr>
       <w:r>
         <w:rPr>
           <w:rFonts w:ascii="Consolas" w:hAnsi="Consolas"/>
@@ -2760,6 +3049,8 @@
     </w:p>
     <w:p>
       <w:pPr>
+        <w:keepNext/>
+        <w:keepLines/>
         <w:ind w:left="360"/>
       </w:pPr>
       <w:r>
@@ -2773,6 +3064,9 @@
       </w:r>
     </w:p>
     <w:p>
+      <w:pPr>
+        <w:keepLines/>
+      </w:pPr>
       <w:r>
         <w:rPr>
           <w:rFonts w:ascii="Consolas" w:hAnsi="Consolas"/>
@@ -2784,6 +3078,8 @@
     </w:p>
     <w:p>
       <w:pPr>
+        <w:keepNext/>
+        <w:keepLines/>
         <w:ind w:left="360"/>
       </w:pPr>
       <w:r>
@@ -2797,6 +3093,9 @@
       </w:r>
     </w:p>
     <w:p>
+      <w:pPr>
+        <w:keepLines/>
+      </w:pPr>
       <w:r>
         <w:rPr>
           <w:rFonts w:ascii="Consolas" w:hAnsi="Consolas"/>
@@ -2808,6 +3107,8 @@
     </w:p>
     <w:p>
       <w:pPr>
+        <w:keepNext/>
+        <w:keepLines/>
         <w:ind w:left="360"/>
       </w:pPr>
       <w:r>
@@ -2821,6 +3122,9 @@
       </w:r>
     </w:p>
     <w:p>
+      <w:pPr>
+        <w:keepLines/>
+      </w:pPr>
       <w:r>
         <w:rPr>
           <w:rFonts w:ascii="Consolas" w:hAnsi="Consolas"/>
@@ -2832,6 +3136,8 @@
     </w:p>
     <w:p>
       <w:pPr>
+        <w:keepNext/>
+        <w:keepLines/>
         <w:ind w:left="360"/>
       </w:pPr>
       <w:r>
@@ -2845,6 +3151,9 @@
       </w:r>
     </w:p>
     <w:p>
+      <w:pPr>
+        <w:keepLines/>
+      </w:pPr>
       <w:r>
         <w:rPr>
           <w:rFonts w:ascii="Consolas" w:hAnsi="Consolas"/>
@@ -2855,6 +3164,9 @@
       </w:r>
     </w:p>
     <w:p>
+      <w:pPr>
+        <w:keepNext/>
+      </w:pPr>
       <w:r>
         <w:rPr>
           <w:b/>
@@ -2888,6 +3200,7 @@
     <w:p>
       <w:pPr>
         <w:pStyle w:val="Heading2"/>
+        <w:keepNext/>
       </w:pPr>
       <w:r>
         <w:t>Lab 7 — Trim, Extend, Fillet and Chamfer</w:t>
@@ -2950,6 +3263,9 @@
       </w:r>
     </w:p>
     <w:p>
+      <w:pPr>
+        <w:keepNext/>
+      </w:pPr>
       <w:r>
         <w:rPr>
           <w:b/>
@@ -2965,6 +3281,9 @@
       </w:r>
     </w:p>
     <w:p>
+      <w:pPr>
+        <w:keepNext/>
+      </w:pPr>
       <w:r>
         <w:rPr>
           <w:b/>
@@ -2976,6 +3295,8 @@
     </w:p>
     <w:p>
       <w:pPr>
+        <w:keepNext w:val="0"/>
+        <w:keepLines/>
         <w:ind w:left="360"/>
       </w:pPr>
       <w:r>
@@ -2990,6 +3311,8 @@
     </w:p>
     <w:p>
       <w:pPr>
+        <w:keepNext/>
+        <w:keepLines/>
         <w:ind w:left="360"/>
       </w:pPr>
       <w:r>
@@ -3003,6 +3326,9 @@
       </w:r>
     </w:p>
     <w:p>
+      <w:pPr>
+        <w:keepLines/>
+      </w:pPr>
       <w:r>
         <w:rPr>
           <w:rFonts w:ascii="Consolas" w:hAnsi="Consolas"/>
@@ -3014,6 +3340,8 @@
     </w:p>
     <w:p>
       <w:pPr>
+        <w:keepNext/>
+        <w:keepLines/>
         <w:ind w:left="360"/>
       </w:pPr>
       <w:r>
@@ -3027,6 +3355,9 @@
       </w:r>
     </w:p>
     <w:p>
+      <w:pPr>
+        <w:keepLines/>
+      </w:pPr>
       <w:r>
         <w:rPr>
           <w:rFonts w:ascii="Consolas" w:hAnsi="Consolas"/>
@@ -3038,6 +3369,8 @@
     </w:p>
     <w:p>
       <w:pPr>
+        <w:keepNext/>
+        <w:keepLines/>
         <w:ind w:left="360"/>
       </w:pPr>
       <w:r>
@@ -3051,6 +3384,9 @@
       </w:r>
     </w:p>
     <w:p>
+      <w:pPr>
+        <w:keepLines/>
+      </w:pPr>
       <w:r>
         <w:rPr>
           <w:rFonts w:ascii="Consolas" w:hAnsi="Consolas"/>
@@ -3062,6 +3398,8 @@
     </w:p>
     <w:p>
       <w:pPr>
+        <w:keepNext/>
+        <w:keepLines/>
         <w:ind w:left="360"/>
       </w:pPr>
       <w:r>
@@ -3075,6 +3413,9 @@
       </w:r>
     </w:p>
     <w:p>
+      <w:pPr>
+        <w:keepLines/>
+      </w:pPr>
       <w:r>
         <w:rPr>
           <w:rFonts w:ascii="Consolas" w:hAnsi="Consolas"/>
@@ -3086,6 +3427,8 @@
     </w:p>
     <w:p>
       <w:pPr>
+        <w:keepNext/>
+        <w:keepLines/>
         <w:ind w:left="360"/>
       </w:pPr>
       <w:r>
@@ -3099,6 +3442,9 @@
       </w:r>
     </w:p>
     <w:p>
+      <w:pPr>
+        <w:keepLines/>
+      </w:pPr>
       <w:r>
         <w:rPr>
           <w:rFonts w:ascii="Consolas" w:hAnsi="Consolas"/>
@@ -3109,6 +3455,9 @@
       </w:r>
     </w:p>
     <w:p>
+      <w:pPr>
+        <w:keepNext/>
+      </w:pPr>
       <w:r>
         <w:rPr>
           <w:b/>
@@ -3142,6 +3491,7 @@
     <w:p>
       <w:pPr>
         <w:pStyle w:val="Heading2"/>
+        <w:keepNext/>
       </w:pPr>
       <w:r>
         <w:t>Lab 8 — Mirror, Stretch, Scale and Arrays</w:t>
@@ -3154,7 +3504,7 @@
     </w:p>
     <w:p>
       <w:r>
-        <w:t>Goal: Produce practice drawing EX-6 by drawing half of the symmetric design and mirroring it, then distributing the hole pattern with rectangular and polar arrays, and adjusting sizes with STRETCH and SCALE.</w:t>
+        <w:t>Goal: Produce practice drawing EX-6 with mirror, stretch, scale and arrays, then inspect the supplied sawblade drawing to reverse-engineer a production polar-array pattern.</w:t>
       </w:r>
     </w:p>
     <w:p>
@@ -3204,6 +3554,9 @@
       </w:r>
     </w:p>
     <w:p>
+      <w:pPr>
+        <w:keepNext/>
+      </w:pPr>
       <w:r>
         <w:rPr>
           <w:b/>
@@ -3215,10 +3568,13 @@
     </w:p>
     <w:p>
       <w:r>
-        <w:t>The completed EX-6 drawing with its symmetric outline and evenly arrayed hole pattern.   (Commands: MIRROR, STRETCH (crossing window), SCALE (Reference), ARRAYRECT, ARRAYPOLAR.)</w:t>
-      </w:r>
-    </w:p>
-    <w:p>
+        <w:t>The completed EX-6 drawing plus a verified sawblade polar array with the correct centre, item count, fill angle and associative state.   (Commands: MIRROR, STRETCH (crossing window), SCALE (Reference), ARRAYRECT, ARRAYPOLAR.)</w:t>
+      </w:r>
+    </w:p>
+    <w:p>
+      <w:pPr>
+        <w:keepNext/>
+      </w:pPr>
       <w:r>
         <w:rPr>
           <w:b/>
@@ -3230,6 +3586,8 @@
     </w:p>
     <w:p>
       <w:pPr>
+        <w:keepNext w:val="0"/>
+        <w:keepLines/>
         <w:ind w:left="360"/>
       </w:pPr>
       <w:r>
@@ -3244,6 +3602,8 @@
     </w:p>
     <w:p>
       <w:pPr>
+        <w:keepNext/>
+        <w:keepLines/>
         <w:ind w:left="360"/>
       </w:pPr>
       <w:r>
@@ -3257,6 +3617,9 @@
       </w:r>
     </w:p>
     <w:p>
+      <w:pPr>
+        <w:keepLines/>
+      </w:pPr>
       <w:r>
         <w:rPr>
           <w:rFonts w:ascii="Consolas" w:hAnsi="Consolas"/>
@@ -3268,6 +3631,8 @@
     </w:p>
     <w:p>
       <w:pPr>
+        <w:keepNext/>
+        <w:keepLines/>
         <w:ind w:left="360"/>
       </w:pPr>
       <w:r>
@@ -3281,6 +3646,9 @@
       </w:r>
     </w:p>
     <w:p>
+      <w:pPr>
+        <w:keepLines/>
+      </w:pPr>
       <w:r>
         <w:rPr>
           <w:rFonts w:ascii="Consolas" w:hAnsi="Consolas"/>
@@ -3292,6 +3660,8 @@
     </w:p>
     <w:p>
       <w:pPr>
+        <w:keepNext/>
+        <w:keepLines/>
         <w:ind w:left="360"/>
       </w:pPr>
       <w:r>
@@ -3301,21 +3671,26 @@
         <w:t xml:space="preserve">4.  </w:t>
       </w:r>
       <w:r>
-        <w:t>Distribute the bolt holes around the centre with a polar array</w:t>
-      </w:r>
-    </w:p>
-    <w:p>
+        <w:t>Distribute the bolt holes around the centre with an associative polar array</w:t>
+      </w:r>
+    </w:p>
+    <w:p>
+      <w:pPr>
+        <w:keepLines/>
+      </w:pPr>
       <w:r>
         <w:rPr>
           <w:rFonts w:ascii="Consolas" w:hAnsi="Consolas"/>
           <w:color w:val="0B3060"/>
           <w:sz w:val="19"/>
         </w:rPr>
-        <w:t xml:space="preserve">     AR → PO → centre → items → 360</w:t>
-      </w:r>
-    </w:p>
-    <w:p>
-      <w:pPr>
+        <w:t xml:space="preserve">     AR → PO → centre → items → 360 → Associative: Yes</w:t>
+      </w:r>
+    </w:p>
+    <w:p>
+      <w:pPr>
+        <w:keepNext/>
+        <w:keepLines/>
         <w:ind w:left="360"/>
       </w:pPr>
       <w:r>
@@ -3329,6 +3704,9 @@
       </w:r>
     </w:p>
     <w:p>
+      <w:pPr>
+        <w:keepLines/>
+      </w:pPr>
       <w:r>
         <w:rPr>
           <w:rFonts w:ascii="Consolas" w:hAnsi="Consolas"/>
@@ -3340,6 +3718,8 @@
     </w:p>
     <w:p>
       <w:pPr>
+        <w:keepNext/>
+        <w:keepLines/>
         <w:ind w:left="360"/>
       </w:pPr>
       <w:r>
@@ -3349,20 +3729,55 @@
         <w:t xml:space="preserve">6.  </w:t>
       </w:r>
       <w:r>
-        <w:t>Verify against ex6.dwg and save</w:t>
-      </w:r>
-    </w:p>
-    <w:p>
+        <w:t>Open sawblade.dwg, select its tooth array and record centre, item count, fill angle and associativity</w:t>
+      </w:r>
+    </w:p>
+    <w:p>
+      <w:pPr>
+        <w:keepLines/>
+      </w:pPr>
       <w:r>
         <w:rPr>
           <w:rFonts w:ascii="Consolas" w:hAnsi="Consolas"/>
           <w:color w:val="0B3060"/>
           <w:sz w:val="19"/>
         </w:rPr>
+        <w:t xml:space="preserve">     OPEN sawblade.dwg → select array → PR</w:t>
+      </w:r>
+    </w:p>
+    <w:p>
+      <w:pPr>
+        <w:keepNext/>
+        <w:keepLines/>
+        <w:ind w:left="360"/>
+      </w:pPr>
+      <w:r>
+        <w:rPr>
+          <w:b/>
+        </w:rPr>
+        <w:t xml:space="preserve">7.  </w:t>
+      </w:r>
+      <w:r>
+        <w:t>Verify against ex6.dwg and save</w:t>
+      </w:r>
+    </w:p>
+    <w:p>
+      <w:pPr>
+        <w:keepLines/>
+      </w:pPr>
+      <w:r>
+        <w:rPr>
+          <w:rFonts w:ascii="Consolas" w:hAnsi="Consolas"/>
+          <w:color w:val="0B3060"/>
+          <w:sz w:val="19"/>
+        </w:rPr>
         <w:t xml:space="preserve">     SAVEAS ex6-mine.dwg</w:t>
       </w:r>
     </w:p>
     <w:p>
+      <w:pPr>
+        <w:keepNext/>
+      </w:pPr>
       <w:r>
         <w:rPr>
           <w:b/>
@@ -3374,7 +3789,7 @@
     </w:p>
     <w:p>
       <w:r>
-        <w:t>The two halves are perfectly symmetric about the centreline, array counts and spacings match the sheet, and the stretched slot measures the dimensioned length.</w:t>
+        <w:t>The two halves are symmetric, array counts and spacings match the sheet, the slot length is correct, and you can explain the four defining properties of the sawblade polar array.</w:t>
       </w:r>
     </w:p>
     <w:p>
@@ -3396,6 +3811,7 @@
     <w:p>
       <w:pPr>
         <w:pStyle w:val="Heading1"/>
+        <w:keepNext/>
       </w:pPr>
       <w:r>
         <w:t>Topic 04 — Organizing Objects  (A4 · K4)</w:t>
@@ -3407,6 +3823,9 @@
       </w:r>
     </w:p>
     <w:p>
+      <w:pPr>
+        <w:keepNext/>
+      </w:pPr>
       <w:r>
         <w:rPr>
           <w:b/>
@@ -3467,6 +3886,7 @@
     <w:p>
       <w:pPr>
         <w:pStyle w:val="Heading2"/>
+        <w:keepNext/>
       </w:pPr>
       <w:r>
         <w:t>Lab 9 — Object Properties and Layers</w:t>
@@ -3479,10 +3899,13 @@
     </w:p>
     <w:p>
       <w:r>
-        <w:t>Goal: Open the furniture drawing lab-table-lesson2.dwg, create a layer scheme (outline, hidden, centre, dimensions, text), assign colours/linetypes/lineweights ByLayer, and move the existing objects onto the correct layers.</w:t>
-      </w:r>
-    </w:p>
-    <w:p>
+        <w:t>Goal: Create a standards-based layer scheme in lab-table-lesson2.dwg, then audit the supplied office-plan-ground-floor.dwg to see how a larger architectural drawing separates systems.</w:t>
+      </w:r>
+    </w:p>
+    <w:p>
+      <w:pPr>
+        <w:keepNext/>
+      </w:pPr>
       <w:r>
         <w:rPr>
           <w:b/>
@@ -3494,10 +3917,13 @@
     </w:p>
     <w:p>
       <w:r>
-        <w:t>A layered version of the table drawing where every object's colour and linetype come ByLayer.   (Commands: LAYER (LA), Properties palette (PR), Layer Walk, MATCHPROP, freeze/thaw, lock.)</w:t>
-      </w:r>
-    </w:p>
-    <w:p>
+        <w:t>A layered table drawing where every object is ByLayer, plus a five-layer audit of the office plan covering naming, colour, linetype, lineweight and plot state.   (Commands: LAYER (LA), Properties palette (PR), Layer Walk, MATCHPROP, freeze/thaw, lock.)</w:t>
+      </w:r>
+    </w:p>
+    <w:p>
+      <w:pPr>
+        <w:keepNext/>
+      </w:pPr>
       <w:r>
         <w:rPr>
           <w:b/>
@@ -3509,6 +3935,8 @@
     </w:p>
     <w:p>
       <w:pPr>
+        <w:keepNext/>
+        <w:keepLines/>
         <w:ind w:left="360"/>
       </w:pPr>
       <w:r>
@@ -3522,6 +3950,9 @@
       </w:r>
     </w:p>
     <w:p>
+      <w:pPr>
+        <w:keepLines/>
+      </w:pPr>
       <w:r>
         <w:rPr>
           <w:rFonts w:ascii="Consolas" w:hAnsi="Consolas"/>
@@ -3533,6 +3964,8 @@
     </w:p>
     <w:p>
       <w:pPr>
+        <w:keepNext/>
+        <w:keepLines/>
         <w:ind w:left="360"/>
       </w:pPr>
       <w:r>
@@ -3546,6 +3979,9 @@
       </w:r>
     </w:p>
     <w:p>
+      <w:pPr>
+        <w:keepLines/>
+      </w:pPr>
       <w:r>
         <w:rPr>
           <w:rFonts w:ascii="Consolas" w:hAnsi="Consolas"/>
@@ -3557,6 +3993,8 @@
     </w:p>
     <w:p>
       <w:pPr>
+        <w:keepNext/>
+        <w:keepLines/>
         <w:ind w:left="360"/>
       </w:pPr>
       <w:r>
@@ -3570,6 +4008,9 @@
       </w:r>
     </w:p>
     <w:p>
+      <w:pPr>
+        <w:keepLines/>
+      </w:pPr>
       <w:r>
         <w:rPr>
           <w:rFonts w:ascii="Consolas" w:hAnsi="Consolas"/>
@@ -3581,6 +4022,8 @@
     </w:p>
     <w:p>
       <w:pPr>
+        <w:keepNext/>
+        <w:keepLines/>
         <w:ind w:left="360"/>
       </w:pPr>
       <w:r>
@@ -3594,6 +4037,9 @@
       </w:r>
     </w:p>
     <w:p>
+      <w:pPr>
+        <w:keepLines/>
+      </w:pPr>
       <w:r>
         <w:rPr>
           <w:rFonts w:ascii="Consolas" w:hAnsi="Consolas"/>
@@ -3605,6 +4051,8 @@
     </w:p>
     <w:p>
       <w:pPr>
+        <w:keepNext/>
+        <w:keepLines/>
         <w:ind w:left="360"/>
       </w:pPr>
       <w:r>
@@ -3618,6 +4066,9 @@
       </w:r>
     </w:p>
     <w:p>
+      <w:pPr>
+        <w:keepLines/>
+      </w:pPr>
       <w:r>
         <w:rPr>
           <w:rFonts w:ascii="Consolas" w:hAnsi="Consolas"/>
@@ -3629,6 +4080,8 @@
     </w:p>
     <w:p>
       <w:pPr>
+        <w:keepNext/>
+        <w:keepLines/>
         <w:ind w:left="360"/>
       </w:pPr>
       <w:r>
@@ -3642,6 +4095,9 @@
       </w:r>
     </w:p>
     <w:p>
+      <w:pPr>
+        <w:keepLines/>
+      </w:pPr>
       <w:r>
         <w:rPr>
           <w:rFonts w:ascii="Consolas" w:hAnsi="Consolas"/>
@@ -3652,6 +4108,38 @@
       </w:r>
     </w:p>
     <w:p>
+      <w:pPr>
+        <w:keepNext/>
+        <w:keepLines/>
+        <w:ind w:left="360"/>
+      </w:pPr>
+      <w:r>
+        <w:rPr>
+          <w:b/>
+        </w:rPr>
+        <w:t xml:space="preserve">7.  </w:t>
+      </w:r>
+      <w:r>
+        <w:t>Open office-plan-ground-floor.dwg and audit five functional layers against the same rules</w:t>
+      </w:r>
+    </w:p>
+    <w:p>
+      <w:pPr>
+        <w:keepLines/>
+      </w:pPr>
+      <w:r>
+        <w:rPr>
+          <w:rFonts w:ascii="Consolas" w:hAnsi="Consolas"/>
+          <w:color w:val="0B3060"/>
+          <w:sz w:val="19"/>
+        </w:rPr>
+        <w:t xml:space="preserve">     OPEN office-plan-ground-floor.dwg → LA → record name/colour/linetype/lineweight/plot</w:t>
+      </w:r>
+    </w:p>
+    <w:p>
+      <w:pPr>
+        <w:keepNext/>
+      </w:pPr>
       <w:r>
         <w:rPr>
           <w:b/>
@@ -3663,7 +4151,7 @@
     </w:p>
     <w:p>
       <w:r>
-        <w:t>Turning each layer off hides exactly its objects, everything reports ByLayer in the Properties palette, and Layer Walk steps cleanly through the scheme.</w:t>
+        <w:t>Turning each layer off hides exactly its objects, everything in table-layers.dwg reports ByLayer, and the office-plan audit identifies five layers with their intended functions.</w:t>
       </w:r>
     </w:p>
     <w:p>
@@ -3685,6 +4173,7 @@
     <w:p>
       <w:pPr>
         <w:pStyle w:val="Heading2"/>
+        <w:keepNext/>
       </w:pPr>
       <w:r>
         <w:t>Lab 10 — Grips, Hide and Isolate</w:t>
@@ -3697,7 +4186,7 @@
     </w:p>
     <w:p>
       <w:r>
-        <w:t>Goal: Use multi-functional grips on practice drawing EX-7 to stretch, move, copy and rotate features without commands, and manage a busy view with Isolate and Hide Selected Objects.</w:t>
+        <w:t>Goal: Use multi-functional grips on EX-7, then practise isolate, hide, select-similar and end-isolate in the denser new-office-design.dwg without losing or deleting objects.</w:t>
       </w:r>
     </w:p>
     <w:p>
@@ -3747,6 +4236,9 @@
       </w:r>
     </w:p>
     <w:p>
+      <w:pPr>
+        <w:keepNext/>
+      </w:pPr>
       <w:r>
         <w:rPr>
           <w:b/>
@@ -3758,10 +4250,13 @@
     </w:p>
     <w:p>
       <w:r>
-        <w:t>An edited EX-7 layout adjusted entirely with grips, plus fluent use of isolate/hide/end-isolate.   (Commands: Multi-functional grips, grip modes (Enter to cycle), Isolate/Hide Objects, Select Similar.)</w:t>
-      </w:r>
-    </w:p>
-    <w:p>
+        <w:t>An edited EX-7 layout plus a saved office-plan view in which the targeted object class was isolated, edited and fully restored.   (Commands: Multi-functional grips, grip modes (Enter to cycle), Isolate/Hide Objects, Select Similar.)</w:t>
+      </w:r>
+    </w:p>
+    <w:p>
+      <w:pPr>
+        <w:keepNext/>
+      </w:pPr>
       <w:r>
         <w:rPr>
           <w:b/>
@@ -3773,6 +4268,8 @@
     </w:p>
     <w:p>
       <w:pPr>
+        <w:keepNext w:val="0"/>
+        <w:keepLines/>
         <w:ind w:left="360"/>
       </w:pPr>
       <w:r>
@@ -3787,6 +4284,8 @@
     </w:p>
     <w:p>
       <w:pPr>
+        <w:keepNext/>
+        <w:keepLines/>
         <w:ind w:left="360"/>
       </w:pPr>
       <w:r>
@@ -3800,6 +4299,9 @@
       </w:r>
     </w:p>
     <w:p>
+      <w:pPr>
+        <w:keepLines/>
+      </w:pPr>
       <w:r>
         <w:rPr>
           <w:rFonts w:ascii="Consolas" w:hAnsi="Consolas"/>
@@ -3811,6 +4313,8 @@
     </w:p>
     <w:p>
       <w:pPr>
+        <w:keepNext/>
+        <w:keepLines/>
         <w:ind w:left="360"/>
       </w:pPr>
       <w:r>
@@ -3824,6 +4328,9 @@
       </w:r>
     </w:p>
     <w:p>
+      <w:pPr>
+        <w:keepLines/>
+      </w:pPr>
       <w:r>
         <w:rPr>
           <w:rFonts w:ascii="Consolas" w:hAnsi="Consolas"/>
@@ -3835,6 +4342,8 @@
     </w:p>
     <w:p>
       <w:pPr>
+        <w:keepNext/>
+        <w:keepLines/>
         <w:ind w:left="360"/>
       </w:pPr>
       <w:r>
@@ -3848,6 +4357,9 @@
       </w:r>
     </w:p>
     <w:p>
+      <w:pPr>
+        <w:keepLines/>
+      </w:pPr>
       <w:r>
         <w:rPr>
           <w:rFonts w:ascii="Consolas" w:hAnsi="Consolas"/>
@@ -3859,6 +4371,8 @@
     </w:p>
     <w:p>
       <w:pPr>
+        <w:keepNext/>
+        <w:keepLines/>
         <w:ind w:left="360"/>
       </w:pPr>
       <w:r>
@@ -3868,21 +4382,26 @@
         <w:t xml:space="preserve">5.  </w:t>
       </w:r>
       <w:r>
-        <w:t>Right-click a feature: Isolate Objects → Isolate Selected, edit it, then End Isolation</w:t>
-      </w:r>
-    </w:p>
-    <w:p>
+        <w:t>Open new-office-design.dwg, select one furniture object and use Select Similar</w:t>
+      </w:r>
+    </w:p>
+    <w:p>
+      <w:pPr>
+        <w:keepLines/>
+      </w:pPr>
       <w:r>
         <w:rPr>
           <w:rFonts w:ascii="Consolas" w:hAnsi="Consolas"/>
           <w:color w:val="0B3060"/>
           <w:sz w:val="19"/>
         </w:rPr>
-        <w:t xml:space="preserve">     ISOLATEOBJECTS · UNISOLATEOBJECTS</w:t>
-      </w:r>
-    </w:p>
-    <w:p>
-      <w:pPr>
+        <w:t xml:space="preserve">     OPEN new-office-design.dwg → select → right-click → Select Similar</w:t>
+      </w:r>
+    </w:p>
+    <w:p>
+      <w:pPr>
+        <w:keepNext/>
+        <w:keepLines/>
         <w:ind w:left="360"/>
       </w:pPr>
       <w:r>
@@ -3892,20 +4411,26 @@
         <w:t xml:space="preserve">6.  </w:t>
       </w:r>
       <w:r>
-        <w:t>Use Select Similar to grab all matching objects and hide them temporarily</w:t>
-      </w:r>
-    </w:p>
-    <w:p>
+        <w:t>Isolate the selection, make one grip edit, hide a second class, then restore everything</w:t>
+      </w:r>
+    </w:p>
+    <w:p>
+      <w:pPr>
+        <w:keepLines/>
+      </w:pPr>
       <w:r>
         <w:rPr>
           <w:rFonts w:ascii="Consolas" w:hAnsi="Consolas"/>
           <w:color w:val="0B3060"/>
           <w:sz w:val="19"/>
         </w:rPr>
-        <w:t xml:space="preserve">     select → right-click → Select Similar → Hide</w:t>
-      </w:r>
-    </w:p>
-    <w:p>
+        <w:t xml:space="preserve">     ISOLATEOBJECTS · HIDEOBJECTS · UNISOLATEOBJECTS</w:t>
+      </w:r>
+    </w:p>
+    <w:p>
+      <w:pPr>
+        <w:keepNext/>
+      </w:pPr>
       <w:r>
         <w:rPr>
           <w:b/>
@@ -3917,7 +4442,7 @@
     </w:p>
     <w:p>
       <w:r>
-        <w:t>You can stretch/move/rotate/copy with grips alone (no typed commands), and isolate then restore any subset of the drawing without losing objects.</w:t>
+        <w:t>You can stretch, move, rotate and copy with grips alone; after UNISOLATEOBJECTS, the office drawing's object count and layer visibility match the starting state except for your saved edit.</w:t>
       </w:r>
     </w:p>
     <w:p>
@@ -3939,6 +4464,7 @@
     <w:p>
       <w:pPr>
         <w:pStyle w:val="Heading2"/>
+        <w:keepNext/>
       </w:pPr>
       <w:r>
         <w:t>Lab 11 — Blocks, Attributes and Part Lists</w:t>
@@ -3951,10 +4477,13 @@
     </w:p>
     <w:p>
       <w:r>
-        <w:t>Goal: Define a reusable part-tag block with attributes (part number, description, quantity) in the title-block drawing, insert it against each component, and prepare the attribute data that will feed the part list.</w:t>
-      </w:r>
-    </w:p>
-    <w:p>
+        <w:t>Goal: Inspect a reusable block library and a drawing containing dynamic blocks, then define a part-tag block with attributes and prepare its data for the part list.</w:t>
+      </w:r>
+    </w:p>
+    <w:p>
+      <w:pPr>
+        <w:keepNext/>
+      </w:pPr>
       <w:r>
         <w:rPr>
           <w:b/>
@@ -3966,10 +4495,13 @@
     </w:p>
     <w:p>
       <w:r>
-        <w:t>A BALLOON block with PART_NO / DESC / QTY attributes, inserted and filled in for each part.   (Commands: BLOCK, ATTDEF, INSERT, ATTEDIT, groups, DATAEXTRACTION (preview).)</w:t>
-      </w:r>
-    </w:p>
-    <w:p>
+        <w:t>A BALLOON block with PART_NO / DESC / QTY attributes, plus evidence that one library block and one dynamic-block state can be inserted and edited correctly.   (Commands: BLOCK, WBLOCK, DesignCenter, ATTDEF, INSERT, ATTEDIT, dynamic-block grips, DATAEXTRACTION.)</w:t>
+      </w:r>
+    </w:p>
+    <w:p>
+      <w:pPr>
+        <w:keepNext/>
+      </w:pPr>
       <w:r>
         <w:rPr>
           <w:b/>
@@ -3981,6 +4513,8 @@
     </w:p>
     <w:p>
       <w:pPr>
+        <w:keepNext/>
+        <w:keepLines/>
         <w:ind w:left="360"/>
       </w:pPr>
       <w:r>
@@ -3990,21 +4524,26 @@
         <w:t xml:space="preserve">1.  </w:t>
       </w:r>
       <w:r>
-        <w:t>Open title-block.dwg and draw the balloon symbol (circle + leader stub)</w:t>
-      </w:r>
-    </w:p>
-    <w:p>
+        <w:t>Open architecture-library.dwg in DesignCenter and insert one reusable symbol into a new drawing</w:t>
+      </w:r>
+    </w:p>
+    <w:p>
+      <w:pPr>
+        <w:keepLines/>
+      </w:pPr>
       <w:r>
         <w:rPr>
           <w:rFonts w:ascii="Consolas" w:hAnsi="Consolas"/>
           <w:color w:val="0B3060"/>
           <w:sz w:val="19"/>
         </w:rPr>
-        <w:t xml:space="preserve">     C → radius 5</w:t>
-      </w:r>
-    </w:p>
-    <w:p>
-      <w:pPr>
+        <w:t xml:space="preserve">     ADCENTER → Folders → architecture-library.dwg → Blocks → Insert</w:t>
+      </w:r>
+    </w:p>
+    <w:p>
+      <w:pPr>
+        <w:keepNext/>
+        <w:keepLines/>
         <w:ind w:left="360"/>
       </w:pPr>
       <w:r>
@@ -4014,21 +4553,26 @@
         <w:t xml:space="preserve">2.  </w:t>
       </w:r>
       <w:r>
-        <w:t>Define attributes PART_NO, DESC and QTY with prompts and default values</w:t>
-      </w:r>
-    </w:p>
-    <w:p>
+        <w:t>Open new-office-dynamic-blocks.dwg and change one dynamic block's grip or visibility state</w:t>
+      </w:r>
+    </w:p>
+    <w:p>
+      <w:pPr>
+        <w:keepLines/>
+      </w:pPr>
       <w:r>
         <w:rPr>
           <w:rFonts w:ascii="Consolas" w:hAnsi="Consolas"/>
           <w:color w:val="0B3060"/>
           <w:sz w:val="19"/>
         </w:rPr>
-        <w:t xml:space="preserve">     ATTDEF → tag/prompt/default</w:t>
-      </w:r>
-    </w:p>
-    <w:p>
-      <w:pPr>
+        <w:t xml:space="preserve">     OPEN new-office-dynamic-blocks.dwg → select dynamic block → grip / Properties</w:t>
+      </w:r>
+    </w:p>
+    <w:p>
+      <w:pPr>
+        <w:keepNext/>
+        <w:keepLines/>
         <w:ind w:left="360"/>
       </w:pPr>
       <w:r>
@@ -4038,21 +4582,26 @@
         <w:t xml:space="preserve">3.  </w:t>
       </w:r>
       <w:r>
-        <w:t>Create the block BALLOON from the circle plus its attribute definitions</w:t>
-      </w:r>
-    </w:p>
-    <w:p>
+        <w:t>Open title-block.dwg and draw the balloon symbol (circle + leader stub)</w:t>
+      </w:r>
+    </w:p>
+    <w:p>
+      <w:pPr>
+        <w:keepLines/>
+      </w:pPr>
       <w:r>
         <w:rPr>
           <w:rFonts w:ascii="Consolas" w:hAnsi="Consolas"/>
           <w:color w:val="0B3060"/>
           <w:sz w:val="19"/>
         </w:rPr>
-        <w:t xml:space="preserve">     B → name BALLOON → select objects</w:t>
-      </w:r>
-    </w:p>
-    <w:p>
-      <w:pPr>
+        <w:t xml:space="preserve">     C → radius 5</w:t>
+      </w:r>
+    </w:p>
+    <w:p>
+      <w:pPr>
+        <w:keepNext/>
+        <w:keepLines/>
         <w:ind w:left="360"/>
       </w:pPr>
       <w:r>
@@ -4062,21 +4611,26 @@
         <w:t xml:space="preserve">4.  </w:t>
       </w:r>
       <w:r>
-        <w:t>Insert the balloon against each component and fill in the attribute values</w:t>
-      </w:r>
-    </w:p>
-    <w:p>
+        <w:t>Define attributes PART_NO, DESC and QTY with prompts and default values</w:t>
+      </w:r>
+    </w:p>
+    <w:p>
+      <w:pPr>
+        <w:keepLines/>
+      </w:pPr>
       <w:r>
         <w:rPr>
           <w:rFonts w:ascii="Consolas" w:hAnsi="Consolas"/>
           <w:color w:val="0B3060"/>
           <w:sz w:val="19"/>
         </w:rPr>
-        <w:t xml:space="preserve">     I → BALLOON → answer prompts</w:t>
-      </w:r>
-    </w:p>
-    <w:p>
-      <w:pPr>
+        <w:t xml:space="preserve">     ATTDEF → tag/prompt/default</w:t>
+      </w:r>
+    </w:p>
+    <w:p>
+      <w:pPr>
+        <w:keepNext/>
+        <w:keepLines/>
         <w:ind w:left="360"/>
       </w:pPr>
       <w:r>
@@ -4086,21 +4640,26 @@
         <w:t xml:space="preserve">5.  </w:t>
       </w:r>
       <w:r>
-        <w:t>Double-click a balloon to edit its attributes; group related parts together</w:t>
-      </w:r>
-    </w:p>
-    <w:p>
+        <w:t>Create the block BALLOON from the circle plus its attribute definitions</w:t>
+      </w:r>
+    </w:p>
+    <w:p>
+      <w:pPr>
+        <w:keepLines/>
+      </w:pPr>
       <w:r>
         <w:rPr>
           <w:rFonts w:ascii="Consolas" w:hAnsi="Consolas"/>
           <w:color w:val="0B3060"/>
           <w:sz w:val="19"/>
         </w:rPr>
-        <w:t xml:space="preserve">     ATTEDIT / EATTEDIT · GROUP</w:t>
-      </w:r>
-    </w:p>
-    <w:p>
-      <w:pPr>
+        <w:t xml:space="preserve">     B → name BALLOON → select objects</w:t>
+      </w:r>
+    </w:p>
+    <w:p>
+      <w:pPr>
+        <w:keepNext/>
+        <w:keepLines/>
         <w:ind w:left="360"/>
       </w:pPr>
       <w:r>
@@ -4110,20 +4669,55 @@
         <w:t xml:space="preserve">6.  </w:t>
       </w:r>
       <w:r>
-        <w:t>Preview extracting the attribute data — this becomes the part list in Lab 14</w:t>
-      </w:r>
-    </w:p>
-    <w:p>
+        <w:t>Insert the balloon against each component and fill in the attribute values</w:t>
+      </w:r>
+    </w:p>
+    <w:p>
+      <w:pPr>
+        <w:keepLines/>
+      </w:pPr>
       <w:r>
         <w:rPr>
           <w:rFonts w:ascii="Consolas" w:hAnsi="Consolas"/>
           <w:color w:val="0B3060"/>
           <w:sz w:val="19"/>
         </w:rPr>
-        <w:t xml:space="preserve">     DATAEXTRACTION</w:t>
-      </w:r>
-    </w:p>
-    <w:p>
+        <w:t xml:space="preserve">     I → BALLOON → answer prompts</w:t>
+      </w:r>
+    </w:p>
+    <w:p>
+      <w:pPr>
+        <w:keepNext/>
+        <w:keepLines/>
+        <w:ind w:left="360"/>
+      </w:pPr>
+      <w:r>
+        <w:rPr>
+          <w:b/>
+        </w:rPr>
+        <w:t xml:space="preserve">7.  </w:t>
+      </w:r>
+      <w:r>
+        <w:t>Edit one balloon attribute, then preview the data extraction used by the Lab 14 part list</w:t>
+      </w:r>
+    </w:p>
+    <w:p>
+      <w:pPr>
+        <w:keepLines/>
+      </w:pPr>
+      <w:r>
+        <w:rPr>
+          <w:rFonts w:ascii="Consolas" w:hAnsi="Consolas"/>
+          <w:color w:val="0B3060"/>
+          <w:sz w:val="19"/>
+        </w:rPr>
+        <w:t xml:space="preserve">     ATTEDIT / EATTEDIT → DATAEXTRACTION</w:t>
+      </w:r>
+    </w:p>
+    <w:p>
+      <w:pPr>
+        <w:keepNext/>
+      </w:pPr>
       <w:r>
         <w:rPr>
           <w:b/>
@@ -4135,7 +4729,7 @@
     </w:p>
     <w:p>
       <w:r>
-        <w:t>Each inserted balloon prompts for and displays its own part number, description and quantity, and Data Extraction lists one row per balloon with the values you entered.</w:t>
+        <w:t>The library block inserts at the correct scale, the dynamic state changes without exploding, and Data Extraction lists one row per BALLOON with the values you entered.</w:t>
       </w:r>
     </w:p>
     <w:p>
@@ -4157,6 +4751,7 @@
     <w:p>
       <w:pPr>
         <w:pStyle w:val="Heading2"/>
+        <w:keepNext/>
       </w:pPr>
       <w:r>
         <w:t>Lab 12 — External References and PDF Import</w:t>
@@ -4169,10 +4764,13 @@
     </w:p>
     <w:p>
       <w:r>
-        <w:t>Goal: Attach the title-block drawing as an external reference under the table drawing, observe how xref updates flow through, then attach a PDF as an underlay and import PDF geometry.</w:t>
-      </w:r>
-    </w:p>
-    <w:p>
+        <w:t>Goal: Repair and verify the relative Landscaping_REV1 Xref in the supplied office-layout host, then attach a title block and a PDF underlay and import vector geometry.</w:t>
+      </w:r>
+    </w:p>
+    <w:p>
+      <w:pPr>
+        <w:keepNext/>
+      </w:pPr>
       <w:r>
         <w:rPr>
           <w:b/>
@@ -4184,10 +4782,13 @@
     </w:p>
     <w:p>
       <w:r>
-        <w:t>A host drawing with a live xref title block and a PDF underlay ready for tracing.   (Commands: XREF/ATTACH, External References palette, PDFATTACH, PDFIMPORT.)</w:t>
-      </w:r>
-    </w:p>
-    <w:p>
+        <w:t>A host drawing whose landscaping Xref resolves from the lab folder, with an additional live title-block Xref and an imported PDF geometry sample.   (Commands: XREF/ATTACH, External References palette, PDFATTACH, PDFIMPORT.)</w:t>
+      </w:r>
+    </w:p>
+    <w:p>
+      <w:pPr>
+        <w:keepNext/>
+      </w:pPr>
       <w:r>
         <w:rPr>
           <w:b/>
@@ -4199,6 +4800,8 @@
     </w:p>
     <w:p>
       <w:pPr>
+        <w:keepNext/>
+        <w:keepLines/>
         <w:ind w:left="360"/>
       </w:pPr>
       <w:r>
@@ -4208,21 +4811,26 @@
         <w:t xml:space="preserve">1.  </w:t>
       </w:r>
       <w:r>
-        <w:t>Open your layered table drawing from Lab 9 as the host drawing</w:t>
-      </w:r>
-    </w:p>
-    <w:p>
+        <w:t>Keep new-office-layout-with-xref.dwg and Landscaping_REV1.dwg together, then open the host</w:t>
+      </w:r>
+    </w:p>
+    <w:p>
+      <w:pPr>
+        <w:keepLines/>
+      </w:pPr>
       <w:r>
         <w:rPr>
           <w:rFonts w:ascii="Consolas" w:hAnsi="Consolas"/>
           <w:color w:val="0B3060"/>
           <w:sz w:val="19"/>
         </w:rPr>
-        <w:t xml:space="preserve">     OPEN table-layers.dwg</w:t>
-      </w:r>
-    </w:p>
-    <w:p>
-      <w:pPr>
+        <w:t xml:space="preserve">     OPEN new-office-layout-with-xref.dwg</w:t>
+      </w:r>
+    </w:p>
+    <w:p>
+      <w:pPr>
+        <w:keepNext/>
+        <w:keepLines/>
         <w:ind w:left="360"/>
       </w:pPr>
       <w:r>
@@ -4232,21 +4840,26 @@
         <w:t xml:space="preserve">2.  </w:t>
       </w:r>
       <w:r>
-        <w:t>Attach title-block.dwg as an Xref at 0,0, scale 1</w:t>
-      </w:r>
-    </w:p>
-    <w:p>
+        <w:t>Open External References and confirm Landscaping_REV1 is Found using a relative path</w:t>
+      </w:r>
+    </w:p>
+    <w:p>
+      <w:pPr>
+        <w:keepLines/>
+      </w:pPr>
       <w:r>
         <w:rPr>
           <w:rFonts w:ascii="Consolas" w:hAnsi="Consolas"/>
           <w:color w:val="0B3060"/>
           <w:sz w:val="19"/>
         </w:rPr>
-        <w:t xml:space="preserve">     XATTACH → title-block.dwg</w:t>
-      </w:r>
-    </w:p>
-    <w:p>
-      <w:pPr>
+        <w:t xml:space="preserve">     XR → Landscaping_REV1 → Saved Path: .\Landscaping_REV1.dwg</w:t>
+      </w:r>
+    </w:p>
+    <w:p>
+      <w:pPr>
+        <w:keepNext/>
+        <w:keepLines/>
         <w:ind w:left="360"/>
       </w:pPr>
       <w:r>
@@ -4256,21 +4869,26 @@
         <w:t xml:space="preserve">3.  </w:t>
       </w:r>
       <w:r>
-        <w:t>Open the External References palette and note the xref's status and path</w:t>
-      </w:r>
-    </w:p>
-    <w:p>
+        <w:t>If unresolved, select a new path in the current lab folder, reload, and retain a relative path</w:t>
+      </w:r>
+    </w:p>
+    <w:p>
+      <w:pPr>
+        <w:keepLines/>
+      </w:pPr>
       <w:r>
         <w:rPr>
           <w:rFonts w:ascii="Consolas" w:hAnsi="Consolas"/>
           <w:color w:val="0B3060"/>
           <w:sz w:val="19"/>
         </w:rPr>
-        <w:t xml:space="preserve">     XR (External References)</w:t>
-      </w:r>
-    </w:p>
-    <w:p>
-      <w:pPr>
+        <w:t xml:space="preserve">     XR → Change Path → Select New Path → Reload</w:t>
+      </w:r>
+    </w:p>
+    <w:p>
+      <w:pPr>
+        <w:keepNext/>
+        <w:keepLines/>
         <w:ind w:left="360"/>
       </w:pPr>
       <w:r>
@@ -4280,21 +4898,26 @@
         <w:t xml:space="preserve">4.  </w:t>
       </w:r>
       <w:r>
-        <w:t>Edit the title block in its own file, save, and reload the xref in the host</w:t>
-      </w:r>
-    </w:p>
-    <w:p>
+        <w:t>Attach title-block.dwg as an additional Xref at 0,0, scale 1</w:t>
+      </w:r>
+    </w:p>
+    <w:p>
+      <w:pPr>
+        <w:keepLines/>
+      </w:pPr>
       <w:r>
         <w:rPr>
           <w:rFonts w:ascii="Consolas" w:hAnsi="Consolas"/>
           <w:color w:val="0B3060"/>
           <w:sz w:val="19"/>
         </w:rPr>
-        <w:t xml:space="preserve">     XR → right-click → Reload</w:t>
-      </w:r>
-    </w:p>
-    <w:p>
-      <w:pPr>
+        <w:t xml:space="preserve">     XATTACH → title-block.dwg</w:t>
+      </w:r>
+    </w:p>
+    <w:p>
+      <w:pPr>
+        <w:keepNext/>
+        <w:keepLines/>
         <w:ind w:left="360"/>
       </w:pPr>
       <w:r>
@@ -4308,6 +4931,9 @@
       </w:r>
     </w:p>
     <w:p>
+      <w:pPr>
+        <w:keepLines/>
+      </w:pPr>
       <w:r>
         <w:rPr>
           <w:rFonts w:ascii="Consolas" w:hAnsi="Consolas"/>
@@ -4319,6 +4945,8 @@
     </w:p>
     <w:p>
       <w:pPr>
+        <w:keepNext/>
+        <w:keepLines/>
         <w:ind w:left="360"/>
       </w:pPr>
       <w:r>
@@ -4332,6 +4960,9 @@
       </w:r>
     </w:p>
     <w:p>
+      <w:pPr>
+        <w:keepLines/>
+      </w:pPr>
       <w:r>
         <w:rPr>
           <w:rFonts w:ascii="Consolas" w:hAnsi="Consolas"/>
@@ -4342,6 +4973,9 @@
       </w:r>
     </w:p>
     <w:p>
+      <w:pPr>
+        <w:keepNext/>
+      </w:pPr>
       <w:r>
         <w:rPr>
           <w:b/>
@@ -4353,7 +4987,7 @@
     </w:p>
     <w:p>
       <w:r>
-        <w:t>Changing the title block file and reloading updates the host without copying geometry, and PDFIMPORT produces editable AutoCAD objects from the underlay.</w:t>
+        <w:t>Both Xrefs show Loaded, Landscaping_REV1 uses a relative path and survives reopening the folder elsewhere, while PDFIMPORT produces editable AutoCAD objects from the underlay.</w:t>
       </w:r>
     </w:p>
     <w:p>
@@ -4375,6 +5009,7 @@
     <w:p>
       <w:pPr>
         <w:pStyle w:val="Heading1"/>
+        <w:keepNext/>
       </w:pPr>
       <w:r>
         <w:t>Topic 05 — Design Documentation  (A5 · K5)</w:t>
@@ -4386,6 +5021,9 @@
       </w:r>
     </w:p>
     <w:p>
+      <w:pPr>
+        <w:keepNext/>
+      </w:pPr>
       <w:r>
         <w:rPr>
           <w:b/>
@@ -4446,6 +5084,7 @@
     <w:p>
       <w:pPr>
         <w:pStyle w:val="Heading2"/>
+        <w:keepNext/>
       </w:pPr>
       <w:r>
         <w:t>Lab 13 — Text and Text Styles</w:t>
@@ -4462,6 +5101,9 @@
       </w:r>
     </w:p>
     <w:p>
+      <w:pPr>
+        <w:keepNext/>
+      </w:pPr>
       <w:r>
         <w:rPr>
           <w:b/>
@@ -4477,6 +5119,9 @@
       </w:r>
     </w:p>
     <w:p>
+      <w:pPr>
+        <w:keepNext/>
+      </w:pPr>
       <w:r>
         <w:rPr>
           <w:b/>
@@ -4488,6 +5133,8 @@
     </w:p>
     <w:p>
       <w:pPr>
+        <w:keepNext/>
+        <w:keepLines/>
         <w:ind w:left="360"/>
       </w:pPr>
       <w:r>
@@ -4501,6 +5148,9 @@
       </w:r>
     </w:p>
     <w:p>
+      <w:pPr>
+        <w:keepLines/>
+      </w:pPr>
       <w:r>
         <w:rPr>
           <w:rFonts w:ascii="Consolas" w:hAnsi="Consolas"/>
@@ -4512,6 +5162,8 @@
     </w:p>
     <w:p>
       <w:pPr>
+        <w:keepNext/>
+        <w:keepLines/>
         <w:ind w:left="360"/>
       </w:pPr>
       <w:r>
@@ -4525,6 +5177,9 @@
       </w:r>
     </w:p>
     <w:p>
+      <w:pPr>
+        <w:keepLines/>
+      </w:pPr>
       <w:r>
         <w:rPr>
           <w:rFonts w:ascii="Consolas" w:hAnsi="Consolas"/>
@@ -4536,6 +5191,8 @@
     </w:p>
     <w:p>
       <w:pPr>
+        <w:keepNext/>
+        <w:keepLines/>
         <w:ind w:left="360"/>
       </w:pPr>
       <w:r>
@@ -4549,6 +5206,9 @@
       </w:r>
     </w:p>
     <w:p>
+      <w:pPr>
+        <w:keepLines/>
+      </w:pPr>
       <w:r>
         <w:rPr>
           <w:rFonts w:ascii="Consolas" w:hAnsi="Consolas"/>
@@ -4560,6 +5220,8 @@
     </w:p>
     <w:p>
       <w:pPr>
+        <w:keepNext/>
+        <w:keepLines/>
         <w:ind w:left="360"/>
       </w:pPr>
       <w:r>
@@ -4573,6 +5235,9 @@
       </w:r>
     </w:p>
     <w:p>
+      <w:pPr>
+        <w:keepLines/>
+      </w:pPr>
       <w:r>
         <w:rPr>
           <w:rFonts w:ascii="Consolas" w:hAnsi="Consolas"/>
@@ -4584,6 +5249,8 @@
     </w:p>
     <w:p>
       <w:pPr>
+        <w:keepNext/>
+        <w:keepLines/>
         <w:ind w:left="360"/>
       </w:pPr>
       <w:r>
@@ -4597,6 +5264,9 @@
       </w:r>
     </w:p>
     <w:p>
+      <w:pPr>
+        <w:keepLines/>
+      </w:pPr>
       <w:r>
         <w:rPr>
           <w:rFonts w:ascii="Consolas" w:hAnsi="Consolas"/>
@@ -4608,6 +5278,8 @@
     </w:p>
     <w:p>
       <w:pPr>
+        <w:keepNext/>
+        <w:keepLines/>
         <w:ind w:left="360"/>
       </w:pPr>
       <w:r>
@@ -4621,6 +5293,9 @@
       </w:r>
     </w:p>
     <w:p>
+      <w:pPr>
+        <w:keepLines/>
+      </w:pPr>
       <w:r>
         <w:rPr>
           <w:rFonts w:ascii="Consolas" w:hAnsi="Consolas"/>
@@ -4631,6 +5306,9 @@
       </w:r>
     </w:p>
     <w:p>
+      <w:pPr>
+        <w:keepNext/>
+      </w:pPr>
       <w:r>
         <w:rPr>
           <w:b/>
@@ -4664,6 +5342,7 @@
     <w:p>
       <w:pPr>
         <w:pStyle w:val="Heading2"/>
+        <w:keepNext/>
       </w:pPr>
       <w:r>
         <w:t>Lab 14 — Dimensions, Multileaders and Part-List Tables</w:t>
@@ -4726,6 +5405,9 @@
       </w:r>
     </w:p>
     <w:p>
+      <w:pPr>
+        <w:keepNext/>
+      </w:pPr>
       <w:r>
         <w:rPr>
           <w:b/>
@@ -4737,10 +5419,13 @@
     </w:p>
     <w:p>
       <w:r>
-        <w:t>A fully dimensioned EX-8 sheet with leader notes and a parts table (part no · description · qty).   (Commands: DIMSTYLE, DIM, DIMLINEAR/ALIGNED/RADIUS/DIAMETER/ANGULAR, DIMCONTINUE, DIMBASELINE, MLEADER, TABLE, DATAEXTRACTION.)</w:t>
-      </w:r>
-    </w:p>
-    <w:p>
+        <w:t>A fully dimensioned EX-8 sheet with leader notes and a parts table (part no · description · qty).   (Commands: DIMSTYLE, DIM, DLI/DAL/DRA/DDI/DAN, DCO/DBA, MLEADER, TABLE, DATAEXTRACTION.)</w:t>
+      </w:r>
+    </w:p>
+    <w:p>
+      <w:pPr>
+        <w:keepNext/>
+      </w:pPr>
       <w:r>
         <w:rPr>
           <w:b/>
@@ -4752,6 +5437,8 @@
     </w:p>
     <w:p>
       <w:pPr>
+        <w:keepNext/>
+        <w:keepLines/>
         <w:ind w:left="360"/>
       </w:pPr>
       <w:r>
@@ -4765,6 +5452,9 @@
       </w:r>
     </w:p>
     <w:p>
+      <w:pPr>
+        <w:keepLines/>
+      </w:pPr>
       <w:r>
         <w:rPr>
           <w:rFonts w:ascii="Consolas" w:hAnsi="Consolas"/>
@@ -4776,6 +5466,8 @@
     </w:p>
     <w:p>
       <w:pPr>
+        <w:keepNext/>
+        <w:keepLines/>
         <w:ind w:left="360"/>
       </w:pPr>
       <w:r>
@@ -4789,6 +5481,9 @@
       </w:r>
     </w:p>
     <w:p>
+      <w:pPr>
+        <w:keepLines/>
+      </w:pPr>
       <w:r>
         <w:rPr>
           <w:rFonts w:ascii="Consolas" w:hAnsi="Consolas"/>
@@ -4800,6 +5495,8 @@
     </w:p>
     <w:p>
       <w:pPr>
+        <w:keepNext/>
+        <w:keepLines/>
         <w:ind w:left="360"/>
       </w:pPr>
       <w:r>
@@ -4813,6 +5510,9 @@
       </w:r>
     </w:p>
     <w:p>
+      <w:pPr>
+        <w:keepLines/>
+      </w:pPr>
       <w:r>
         <w:rPr>
           <w:rFonts w:ascii="Consolas" w:hAnsi="Consolas"/>
@@ -4824,6 +5524,8 @@
     </w:p>
     <w:p>
       <w:pPr>
+        <w:keepNext/>
+        <w:keepLines/>
         <w:ind w:left="360"/>
       </w:pPr>
       <w:r>
@@ -4837,6 +5539,9 @@
       </w:r>
     </w:p>
     <w:p>
+      <w:pPr>
+        <w:keepLines/>
+      </w:pPr>
       <w:r>
         <w:rPr>
           <w:rFonts w:ascii="Consolas" w:hAnsi="Consolas"/>
@@ -4848,6 +5553,8 @@
     </w:p>
     <w:p>
       <w:pPr>
+        <w:keepNext/>
+        <w:keepLines/>
         <w:ind w:left="360"/>
       </w:pPr>
       <w:r>
@@ -4861,6 +5568,9 @@
       </w:r>
     </w:p>
     <w:p>
+      <w:pPr>
+        <w:keepLines/>
+      </w:pPr>
       <w:r>
         <w:rPr>
           <w:rFonts w:ascii="Consolas" w:hAnsi="Consolas"/>
@@ -4872,6 +5582,8 @@
     </w:p>
     <w:p>
       <w:pPr>
+        <w:keepNext/>
+        <w:keepLines/>
         <w:ind w:left="360"/>
       </w:pPr>
       <w:r>
@@ -4885,6 +5597,9 @@
       </w:r>
     </w:p>
     <w:p>
+      <w:pPr>
+        <w:keepLines/>
+      </w:pPr>
       <w:r>
         <w:rPr>
           <w:rFonts w:ascii="Consolas" w:hAnsi="Consolas"/>
@@ -4896,6 +5611,8 @@
     </w:p>
     <w:p>
       <w:pPr>
+        <w:keepNext/>
+        <w:keepLines/>
         <w:ind w:left="360"/>
       </w:pPr>
       <w:r>
@@ -4909,6 +5626,9 @@
       </w:r>
     </w:p>
     <w:p>
+      <w:pPr>
+        <w:keepLines/>
+      </w:pPr>
       <w:r>
         <w:rPr>
           <w:rFonts w:ascii="Consolas" w:hAnsi="Consolas"/>
@@ -4919,6 +5639,9 @@
       </w:r>
     </w:p>
     <w:p>
+      <w:pPr>
+        <w:keepNext/>
+      </w:pPr>
       <w:r>
         <w:rPr>
           <w:b/>
@@ -4952,6 +5675,7 @@
     <w:p>
       <w:pPr>
         <w:pStyle w:val="Heading2"/>
+        <w:keepNext/>
       </w:pPr>
       <w:r>
         <w:t>Lab 15 — Hatching and Detail Finishing</w:t>
@@ -4964,10 +5688,13 @@
     </w:p>
     <w:p>
       <w:r>
-        <w:t>Goal: Apply section hatching to the closed areas of a section view — pattern, scale and angle — use gradient fills for presentation, and control hatch boundaries and islands.</w:t>
-      </w:r>
-    </w:p>
-    <w:p>
+        <w:t>Goal: Apply section hatching with controlled boundaries and islands, then compare two supplied landscaping revisions and mark the changed area with a revision cloud and note.</w:t>
+      </w:r>
+    </w:p>
+    <w:p>
+      <w:pPr>
+        <w:keepNext/>
+      </w:pPr>
       <w:r>
         <w:rPr>
           <w:b/>
@@ -4979,10 +5706,13 @@
     </w:p>
     <w:p>
       <w:r>
-        <w:t>A section view with correct ANSI/ISO hatch patterns and a presentation-filled elevation.   (Commands: HATCH (pattern/scale/angle), gradient fills, boundary/island detection, HATCHEDIT.)</w:t>
-      </w:r>
-    </w:p>
-    <w:p>
+        <w:t>A correctly hatched section view plus a documented landscaping revision showing the changed geometry, revision cloud and concise change note.   (Commands: HATCH, gradient fills, boundary/island detection, HATCHEDIT, DWG Compare, REVCLOUD, MLEADER.)</w:t>
+      </w:r>
+    </w:p>
+    <w:p>
+      <w:pPr>
+        <w:keepNext/>
+      </w:pPr>
       <w:r>
         <w:rPr>
           <w:b/>
@@ -4994,6 +5724,8 @@
     </w:p>
     <w:p>
       <w:pPr>
+        <w:keepNext w:val="0"/>
+        <w:keepLines/>
         <w:ind w:left="360"/>
       </w:pPr>
       <w:r>
@@ -5008,6 +5740,8 @@
     </w:p>
     <w:p>
       <w:pPr>
+        <w:keepNext/>
+        <w:keepLines/>
         <w:ind w:left="360"/>
       </w:pPr>
       <w:r>
@@ -5021,6 +5755,9 @@
       </w:r>
     </w:p>
     <w:p>
+      <w:pPr>
+        <w:keepLines/>
+      </w:pPr>
       <w:r>
         <w:rPr>
           <w:rFonts w:ascii="Consolas" w:hAnsi="Consolas"/>
@@ -5032,6 +5769,8 @@
     </w:p>
     <w:p>
       <w:pPr>
+        <w:keepNext/>
+        <w:keepLines/>
         <w:ind w:left="360"/>
       </w:pPr>
       <w:r>
@@ -5045,6 +5784,9 @@
       </w:r>
     </w:p>
     <w:p>
+      <w:pPr>
+        <w:keepLines/>
+      </w:pPr>
       <w:r>
         <w:rPr>
           <w:rFonts w:ascii="Consolas" w:hAnsi="Consolas"/>
@@ -5056,6 +5798,8 @@
     </w:p>
     <w:p>
       <w:pPr>
+        <w:keepNext/>
+        <w:keepLines/>
         <w:ind w:left="360"/>
       </w:pPr>
       <w:r>
@@ -5069,6 +5813,9 @@
       </w:r>
     </w:p>
     <w:p>
+      <w:pPr>
+        <w:keepLines/>
+      </w:pPr>
       <w:r>
         <w:rPr>
           <w:rFonts w:ascii="Consolas" w:hAnsi="Consolas"/>
@@ -5080,6 +5827,8 @@
     </w:p>
     <w:p>
       <w:pPr>
+        <w:keepNext/>
+        <w:keepLines/>
         <w:ind w:left="360"/>
       </w:pPr>
       <w:r>
@@ -5093,6 +5842,9 @@
       </w:r>
     </w:p>
     <w:p>
+      <w:pPr>
+        <w:keepLines/>
+      </w:pPr>
       <w:r>
         <w:rPr>
           <w:rFonts w:ascii="Consolas" w:hAnsi="Consolas"/>
@@ -5104,6 +5856,8 @@
     </w:p>
     <w:p>
       <w:pPr>
+        <w:keepNext/>
+        <w:keepLines/>
         <w:ind w:left="360"/>
       </w:pPr>
       <w:r>
@@ -5117,6 +5871,9 @@
       </w:r>
     </w:p>
     <w:p>
+      <w:pPr>
+        <w:keepLines/>
+      </w:pPr>
       <w:r>
         <w:rPr>
           <w:rFonts w:ascii="Consolas" w:hAnsi="Consolas"/>
@@ -5127,6 +5884,67 @@
       </w:r>
     </w:p>
     <w:p>
+      <w:pPr>
+        <w:keepNext/>
+        <w:keepLines/>
+        <w:ind w:left="360"/>
+      </w:pPr>
+      <w:r>
+        <w:rPr>
+          <w:b/>
+        </w:rPr>
+        <w:t xml:space="preserve">7.  </w:t>
+      </w:r>
+      <w:r>
+        <w:t>Compare landscaping-rev1.dwg with landscaping-rev2.dwg and isolate the changed geometry</w:t>
+      </w:r>
+    </w:p>
+    <w:p>
+      <w:pPr>
+        <w:keepLines/>
+      </w:pPr>
+      <w:r>
+        <w:rPr>
+          <w:rFonts w:ascii="Consolas" w:hAnsi="Consolas"/>
+          <w:color w:val="0B3060"/>
+          <w:sz w:val="19"/>
+        </w:rPr>
+        <w:t xml:space="preserve">     COMPARE → landscaping-rev2.dwg</w:t>
+      </w:r>
+    </w:p>
+    <w:p>
+      <w:pPr>
+        <w:keepNext/>
+        <w:keepLines/>
+        <w:ind w:left="360"/>
+      </w:pPr>
+      <w:r>
+        <w:rPr>
+          <w:b/>
+        </w:rPr>
+        <w:t xml:space="preserve">8.  </w:t>
+      </w:r>
+      <w:r>
+        <w:t>Cloud the change and add a concise multileader note before saving the review copy</w:t>
+      </w:r>
+    </w:p>
+    <w:p>
+      <w:pPr>
+        <w:keepLines/>
+      </w:pPr>
+      <w:r>
+        <w:rPr>
+          <w:rFonts w:ascii="Consolas" w:hAnsi="Consolas"/>
+          <w:color w:val="0B3060"/>
+          <w:sz w:val="19"/>
+        </w:rPr>
+        <w:t xml:space="preserve">     REVCLOUD → MLEADER → SAVEAS landscaping-review.dwg</w:t>
+      </w:r>
+    </w:p>
+    <w:p>
+      <w:pPr>
+        <w:keepNext/>
+      </w:pPr>
       <w:r>
         <w:rPr>
           <w:b/>
@@ -5138,7 +5956,7 @@
     </w:p>
     <w:p>
       <w:r>
-        <w:t>Hatches stay inside their boundaries (no bleed), adjacent parts hatch at different angles, and text/holes remain unhatched islands.</w:t>
+        <w:t>Hatches do not bleed, adjacent parts use distinct angles, islands remain clear, and the landscaping review identifies every revision with one cloud and one readable note.</w:t>
       </w:r>
     </w:p>
     <w:p>
@@ -5160,6 +5978,7 @@
     <w:p>
       <w:pPr>
         <w:pStyle w:val="Heading2"/>
+        <w:keepNext/>
       </w:pPr>
       <w:r>
         <w:t>Lab 16 — Layouts, Viewports and Plotting</w:t>
@@ -5172,10 +5991,13 @@
     </w:p>
     <w:p>
       <w:r>
-        <w:t>Goal: Compose an A3 layout: attach the title block, create scaled viewports (1:20 and a detail), lock them, and plot the sheet to PDF — the standard submission output.</w:t>
-      </w:r>
-    </w:p>
-    <w:p>
+        <w:t>Goal: Audit the supplied new-office-layout.dwg, then compose an A3 layout with a title block, locked scaled viewports and a standards-compliant PDF plot.</w:t>
+      </w:r>
+    </w:p>
+    <w:p>
+      <w:pPr>
+        <w:keepNext/>
+      </w:pPr>
       <w:r>
         <w:rPr>
           <w:b/>
@@ -5187,10 +6009,13 @@
     </w:p>
     <w:p>
       <w:r>
-        <w:t>A print-ready A3 layout with title block, two locked scaled viewports and a plotted PDF.   (Commands: LAYOUT, PAGESETUP, MVIEW, viewport scale/lock, PLOT, DWG to PDF.pc3.)</w:t>
-      </w:r>
-    </w:p>
-    <w:p>
+        <w:t>A print-ready A3 office layout with two locked viewports, completed title information, verified lineweights and a plotted PDF.   (Commands: LAYOUT, PAGESETUP, MVIEW, viewport scale/lock, PLOT, DWG to PDF.pc3.)</w:t>
+      </w:r>
+    </w:p>
+    <w:p>
+      <w:pPr>
+        <w:keepNext/>
+      </w:pPr>
       <w:r>
         <w:rPr>
           <w:b/>
@@ -5202,6 +6027,8 @@
     </w:p>
     <w:p>
       <w:pPr>
+        <w:keepNext/>
+        <w:keepLines/>
         <w:ind w:left="360"/>
       </w:pPr>
       <w:r>
@@ -5211,21 +6038,26 @@
         <w:t xml:space="preserve">1.  </w:t>
       </w:r>
       <w:r>
-        <w:t>Open your annotated drawing, switch to a Layout tab and rename it A3-SHEET</w:t>
-      </w:r>
-    </w:p>
-    <w:p>
+        <w:t>Open new-office-layout.dwg, inspect its model/layout tabs and save a working copy</w:t>
+      </w:r>
+    </w:p>
+    <w:p>
+      <w:pPr>
+        <w:keepLines/>
+      </w:pPr>
       <w:r>
         <w:rPr>
           <w:rFonts w:ascii="Consolas" w:hAnsi="Consolas"/>
           <w:color w:val="0B3060"/>
           <w:sz w:val="19"/>
         </w:rPr>
-        <w:t xml:space="preserve">     right-click tab → Rename</w:t>
-      </w:r>
-    </w:p>
-    <w:p>
-      <w:pPr>
+        <w:t xml:space="preserve">     OPEN new-office-layout.dwg → SAVEAS office-layout-mine.dwg</w:t>
+      </w:r>
+    </w:p>
+    <w:p>
+      <w:pPr>
+        <w:keepNext/>
+        <w:keepLines/>
         <w:ind w:left="360"/>
       </w:pPr>
       <w:r>
@@ -5235,10 +6067,13 @@
         <w:t xml:space="preserve">2.  </w:t>
       </w:r>
       <w:r>
-        <w:t>Set the page: DWG To PDF.pc3, ISO A3 (420×297), landscape, 1:1 plot scale</w:t>
-      </w:r>
-    </w:p>
-    <w:p>
+        <w:t>Rename the working layout A3-SHEET and set DWG To PDF.pc3, ISO A3 landscape, 1:1</w:t>
+      </w:r>
+    </w:p>
+    <w:p>
+      <w:pPr>
+        <w:keepLines/>
+      </w:pPr>
       <w:r>
         <w:rPr>
           <w:rFonts w:ascii="Consolas" w:hAnsi="Consolas"/>
@@ -5250,6 +6085,8 @@
     </w:p>
     <w:p>
       <w:pPr>
+        <w:keepNext/>
+        <w:keepLines/>
         <w:ind w:left="360"/>
       </w:pPr>
       <w:r>
@@ -5263,6 +6100,9 @@
       </w:r>
     </w:p>
     <w:p>
+      <w:pPr>
+        <w:keepLines/>
+      </w:pPr>
       <w:r>
         <w:rPr>
           <w:rFonts w:ascii="Consolas" w:hAnsi="Consolas"/>
@@ -5274,6 +6114,8 @@
     </w:p>
     <w:p>
       <w:pPr>
+        <w:keepNext/>
+        <w:keepLines/>
         <w:ind w:left="360"/>
       </w:pPr>
       <w:r>
@@ -5287,6 +6129,9 @@
       </w:r>
     </w:p>
     <w:p>
+      <w:pPr>
+        <w:keepLines/>
+      </w:pPr>
       <w:r>
         <w:rPr>
           <w:rFonts w:ascii="Consolas" w:hAnsi="Consolas"/>
@@ -5298,6 +6143,8 @@
     </w:p>
     <w:p>
       <w:pPr>
+        <w:keepNext/>
+        <w:keepLines/>
         <w:ind w:left="360"/>
       </w:pPr>
       <w:r>
@@ -5311,6 +6158,9 @@
       </w:r>
     </w:p>
     <w:p>
+      <w:pPr>
+        <w:keepLines/>
+      </w:pPr>
       <w:r>
         <w:rPr>
           <w:rFonts w:ascii="Consolas" w:hAnsi="Consolas"/>
@@ -5322,6 +6172,8 @@
     </w:p>
     <w:p>
       <w:pPr>
+        <w:keepNext/>
+        <w:keepLines/>
         <w:ind w:left="360"/>
       </w:pPr>
       <w:r>
@@ -5335,6 +6187,9 @@
       </w:r>
     </w:p>
     <w:p>
+      <w:pPr>
+        <w:keepLines/>
+      </w:pPr>
       <w:r>
         <w:rPr>
           <w:rFonts w:ascii="Consolas" w:hAnsi="Consolas"/>
@@ -5345,6 +6200,9 @@
       </w:r>
     </w:p>
     <w:p>
+      <w:pPr>
+        <w:keepNext/>
+      </w:pPr>
       <w:r>
         <w:rPr>
           <w:b/>
@@ -5378,6 +6236,7 @@
     <w:p>
       <w:pPr>
         <w:pStyle w:val="Heading1"/>
+        <w:keepNext/>
       </w:pPr>
       <w:r>
         <w:t>Reading Technical Drawings — Quick Reference</w:t>
@@ -5439,6 +6298,7 @@
     <w:p>
       <w:pPr>
         <w:pStyle w:val="Heading1"/>
+        <w:keepNext/>
       </w:pPr>
       <w:r>
         <w:t>Preparing for the Assessment</w:t>
@@ -5481,20 +6341,13 @@
         <w:pStyle w:val="ListBullet"/>
       </w:pPr>
       <w:r>
-        <w:t>Sharpen your readiness with the Tertiary Infotech AutoCAD practice exam: https://exams.tertiaryinfotech.com/practice-exams/autodesk/autocad</w:t>
-      </w:r>
-    </w:p>
-    <w:p>
-      <w:pPr>
-        <w:pStyle w:val="ListBullet"/>
-      </w:pPr>
-      <w:r>
         <w:t>Course materials, assessment submission and your certificate are on the LMS: https://lms-tms.tertiaryinfotech.com</w:t>
       </w:r>
     </w:p>
     <w:p>
       <w:pPr>
         <w:pStyle w:val="Heading1"/>
+        <w:keepNext/>
       </w:pPr>
       <w:r>
         <w:t>Glossary</w:t>

</xml_diff>